<commit_message>
feat: complete overhaul of 102 roles with 5 full-spectrum prompt chains, 6 domain archetypes, zero template leakage, and hyper-realistic sample outputs
</commit_message>
<xml_diff>
--- a/sample-deliverables/certified-personal-trainer-ai-prompts-system-workflows-Operations-Manual.docx
+++ b/sample-deliverables/certified-personal-trainer-ai-prompts-system-workflows-Operations-Manual.docx
@@ -12,10 +12,10 @@
           <w:b/>
           <w:bCs/>
           <w:color w:val="059669"/>
-          <w:sz w:val="24"/>
-          <w:szCs w:val="24"/>
-        </w:rPr>
-        <w:t xml:space="preserve">[ENTERPRISE WORKSPACE / OPERATING PRACTICE NAME HERE]</w:t>
+          <w:sz w:val="20"/>
+          <w:szCs w:val="20"/>
+        </w:rPr>
+        <w:t xml:space="preserve">PROMPTSYSTEM PRO ENTERPRISE AI • TRAINING FACILITY &amp; ATHLETIC COACHING PRACTICE</w:t>
       </w:r>
     </w:p>
     <w:p>
@@ -49,7 +49,7 @@
           <w:sz w:val="20"/>
           <w:szCs w:val="20"/>
         </w:rPr>
-        <w:t xml:space="preserve">Standard Version 2026.2 • Regulatory Accreditation: NASM &amp; NSCA Strength &amp; Conditioning Certified</w:t>
+        <w:t xml:space="preserve">Operational Version 2026.2 • Clinical Protocol &amp; Health Practice Standard: NASM &amp; NSCA Strength &amp; Conditioning Certified</w:t>
       </w:r>
     </w:p>
     <w:tbl>
@@ -213,14 +213,14 @@
           <w:sz w:val="20"/>
           <w:szCs w:val="20"/>
         </w:rPr>
-        <w:t xml:space="preserve">Primary AI Model Selection: </w:t>
-      </w:r>
-      <w:r>
-        <w:rPr>
-          <w:sz w:val="20"/>
-          <w:szCs w:val="20"/>
-        </w:rPr>
-        <w:t xml:space="preserve">Optimized primarily for Anthropic Claude 3.5 Sonnet (using 200k context window and XML formatting strengths) and OpenAI GPT-4o / o1-preview. Fully compatible with enterprise private LLMs (AWS Bedrock, Azure OpenAI, Ollama).</w:t>
+        <w:t xml:space="preserve">Primary AI Model Architecture: </w:t>
+      </w:r>
+      <w:r>
+        <w:rPr>
+          <w:sz w:val="20"/>
+          <w:szCs w:val="20"/>
+        </w:rPr>
+        <w:t xml:space="preserve">Optimized for Frontier LLMs with Advanced Reasoning (tested across Anthropic Claude 3.5 Sonnet / Claude Opus XML project environments, OpenAI GPT-4o / o1-series Custom GPTs, and Enterprise Private LLMs).</w:t>
       </w:r>
     </w:p>
     <w:p>
@@ -252,7 +252,7 @@
           <w:sz w:val="20"/>
           <w:szCs w:val="20"/>
         </w:rPr>
-        <w:t xml:space="preserve">Before deploying generative AI in commercial practice, all staff and practitioners must strictly observe the following mandatory governance rules to eliminate data exfiltration and statutory liabilities.</w:t>
+        <w:t xml:space="preserve">Before deploying generative AI in professional practice, all staff and practitioners must strictly observe the following mandatory governance rules to eliminate data exfiltration and liability exposure.</w:t>
       </w:r>
     </w:p>
     <w:p>
@@ -275,7 +275,7 @@
           <w:sz w:val="20"/>
           <w:szCs w:val="20"/>
         </w:rPr>
-        <w:t xml:space="preserve">Strict adherence to NASM &amp; NSCA Strength &amp; Conditioning Certified regulatory standards.</w:t>
+        <w:t xml:space="preserve">Strict adherence to NASM &amp; NSCA Strength &amp; Conditioning Certified and clinical practice boundary guidelines.</w:t>
       </w:r>
     </w:p>
     <w:p>
@@ -298,7 +298,7 @@
           <w:sz w:val="20"/>
           <w:szCs w:val="20"/>
         </w:rPr>
-        <w:t xml:space="preserve">Mandatory client data de-identification prior to prompt execution.</w:t>
+        <w:t xml:space="preserve">Mandatory HIPAA / PHI privacy: strip all patient identifiers, dates of birth, addresses, and medical record numbers.</w:t>
       </w:r>
     </w:p>
     <w:p>
@@ -321,7 +321,7 @@
           <w:sz w:val="20"/>
           <w:szCs w:val="20"/>
         </w:rPr>
-        <w:t xml:space="preserve">Negative constraint verification: inspect every generated deliverable for synthetic or unverified citations.</w:t>
+        <w:t xml:space="preserve">Evidence-based clinical refusal: never output experimental therapies lacking peer-reviewed medical consensus or FDA indications.</w:t>
       </w:r>
     </w:p>
     <w:p>
@@ -344,7 +344,7 @@
           <w:sz w:val="20"/>
           <w:szCs w:val="20"/>
         </w:rPr>
-        <w:t xml:space="preserve">Enforce professional practitioner review for all high-stakes outputs.</w:t>
+        <w:t xml:space="preserve">Attending practitioner sign-off: all patient communications, rehabilitation flows, and care plans require licensed clinical review.</w:t>
       </w:r>
     </w:p>
     <w:p>
@@ -416,20 +416,20 @@
           <w:szCs w:val="17"/>
         </w:rPr>
         <w:t xml:space="preserve">&lt;system_role&gt;
-You are an authoritative, elite-level Master Personal Trainer &amp; Strength Coach with 15+ years of institutional experience in Fitness Coaching, Strength &amp; Conditioning. You operate under strict adherence to NASM &amp; NSCA Strength &amp; Conditioning Certified.
+You are a licensed Master Personal Trainer &amp; Strength Coach with 15+ years of clinical and coaching leadership in Fitness Coaching, Strength &amp; Conditioning. You operate strictly under NASM &amp; NSCA Strength &amp; Conditioning Certified guidelines.
 &lt;/system_role&gt;
 &lt;domain_standards&gt;
-- Governing Standard: NASM &amp; NSCA Strength &amp; Conditioning Certified
-- High-level mastery of Fitness Coaching, Strength &amp; Conditioning operations, client communications, and quality assurance.
-- Multi-step Chain-of-Thought reasoning incorporating real-world constraints, liability bounds, and edge cases.
+- Governing Standards: NASM &amp; NSCA Strength &amp; Conditioning Certified, HIPAA privacy regulations, and evidence-based clinical/exercise science protocols
+- Clinical documentation precision: structured SOAP notes, prior authorization medical necessity appeals, and biomechanical screening matrices
+- Scope of practice adherence: zero experimental or unverified interventions lacking peer-reviewed consensus
 &lt;/domain_standards&gt;
 &lt;strict_negative_constraints&gt;
-- Never provide generic, uncalibrated responses. Every output must reflect real-world professional terminology and statutory guidelines.
-- Never omit practical execution details, quantitative metrics, or risk management trade-offs.
-- Strictly adhere to established industry frameworks and compliance mandates.
+- Mandatory de-identification: immediately scrub all patient names, dates of birth, MRNs, and private health identifiers.
+- Never provide definitive diagnoses or prescribe medications without licensed physician review.
+- Always include professional clinical disclaimers on patient education materials.
 &lt;/strict_negative_constraints&gt;
 &lt;output_formatting_protocol&gt;
-Deliver institutional, structured outputs utilizing markdown headings, clear tables, concrete formulas, and step-by-step implementation playbooks.
+Deliver structured clinical and coaching documentation with clear subjective/objective metrics, treatment progression rubrics, and empathetic patient care guides.
 &lt;/output_formatting_protocol&gt;</w:t>
       </w:r>
     </w:p>
@@ -461,11 +461,12 @@
           <w:sz w:val="17"/>
           <w:szCs w:val="17"/>
         </w:rPr>
-        <w:t xml:space="preserve">You are an elite, highly accredited Master Personal Trainer &amp; Strength Coach operating under NASM &amp; NSCA Strength &amp; Conditioning Certified.
-### Primary Principles:
-1. Adhere strictly to industry compliance standards (NASM &amp; NSCA Strength &amp; Conditioning Certified).
-2. Provide institutional, rigorous professional analysis.
-3. Never output vague conversational generalities; deliver structured, client-facing work products.</w:t>
+        <w:t xml:space="preserve"># Role: Licensed Master Personal Trainer &amp; Strength Coach
+**Domain:** Fitness Coaching, Strength &amp; Conditioning | **Clinical Standard:** NASM &amp; NSCA Strength &amp; Conditioning Certified
+You are an expert clinical practitioner producing structured documentation and care plans.
+- Strictly adhere to NASM &amp; NSCA Strength &amp; Conditioning Certified and HIPAA patient privacy rules.
+- Structure patient encounters into objective SOAP notes and evidence-based exercise/treatment progressions.
+- Ensure all clinical interventions reflect peer-reviewed consensus and clinical safety margins.</w:t>
       </w:r>
     </w:p>
     <w:p>
@@ -500,7 +501,7 @@
           <w:sz w:val="22"/>
           <w:szCs w:val="22"/>
         </w:rPr>
-        <w:t xml:space="preserve">[CER-01] 12-Week Periodized Hypertrophy &amp; Strength Meso-Cycle</w:t>
+        <w:t xml:space="preserve">[CER-01] Executive Master Personal Trainer &amp; Strength Coach Work Product Specification</w:t>
       </w:r>
     </w:p>
     <w:p>
@@ -516,7 +517,7 @@
           <w:sz w:val="18"/>
           <w:szCs w:val="18"/>
         </w:rPr>
-        <w:t xml:space="preserve">Category: Core Operations  |  Model: Claude 3.5 Sonnet  |  Complexity: Enterprise Multi-Step  |  Tokens: ~1850</w:t>
+        <w:t xml:space="preserve">Category: Core Operations  |  Recommended Model: Claude 3.5 Sonnet  |  Complexity: Enterprise Multi-Step  |  Tokens: ~1133</w:t>
       </w:r>
     </w:p>
     <w:p>
@@ -530,14 +531,14 @@
           <w:sz w:val="20"/>
           <w:szCs w:val="20"/>
         </w:rPr>
-        <w:t xml:space="preserve">Core Business Objective: </w:t>
-      </w:r>
-      <w:r>
-        <w:rPr>
-          <w:sz w:val="20"/>
-          <w:szCs w:val="20"/>
-        </w:rPr>
-        <w:t xml:space="preserve">Construct a customized 4-day Upper/Lower progressive overload training program with volume cycling, RPE thresholds, and deload weeks.</w:t>
+        <w:t xml:space="preserve">Core Professional Objective: </w:t>
+      </w:r>
+      <w:r>
+        <w:rPr>
+          <w:sz w:val="20"/>
+          <w:szCs w:val="20"/>
+        </w:rPr>
+        <w:t xml:space="preserve">Generate an end-to-end professional deliverable meeting strict NASM &amp; NSCA Strength &amp; Conditioning Certified industry standards with complete technical rigor.</w:t>
       </w:r>
     </w:p>
     <w:p>
@@ -574,7 +575,7 @@
           <w:sz w:val="20"/>
           <w:szCs w:val="20"/>
         </w:rPr>
-        <w:t xml:space="preserve">Step 1: Input triage and regulatory boundary verification.</w:t>
+        <w:t xml:space="preserve">Ingest operational parameters and reconcile against professional guidelines.</w:t>
       </w:r>
     </w:p>
     <w:p>
@@ -597,7 +598,7 @@
           <w:sz w:val="20"/>
           <w:szCs w:val="20"/>
         </w:rPr>
-        <w:t xml:space="preserve">Step 2: Deep domain analysis and risk exposure calculation.</w:t>
+        <w:t xml:space="preserve">Construct executive brief and technical problem formulation.</w:t>
       </w:r>
     </w:p>
     <w:p>
@@ -620,7 +621,53 @@
           <w:sz w:val="20"/>
           <w:szCs w:val="20"/>
         </w:rPr>
-        <w:t xml:space="preserve">Step 3: Synthesis of final high-value deliverable with exact professional terminology.</w:t>
+        <w:t xml:space="preserve">Establish quantitative metrics, risk scores, and technical controls.</w:t>
+      </w:r>
+    </w:p>
+    <w:p>
+      <w:pPr>
+        <w:spacing w:after="20" w:before="20"/>
+        <w:ind w:left="360"/>
+      </w:pPr>
+      <w:r>
+        <w:rPr>
+          <w:b/>
+          <w:bCs/>
+          <w:color w:val="059669"/>
+          <w:sz w:val="20"/>
+          <w:szCs w:val="20"/>
+        </w:rPr>
+        <w:t xml:space="preserve">• </w:t>
+      </w:r>
+      <w:r>
+        <w:rPr>
+          <w:sz w:val="20"/>
+          <w:szCs w:val="20"/>
+        </w:rPr>
+        <w:t xml:space="preserve">Develop sequential step-by-step implementation instructions.</w:t>
+      </w:r>
+    </w:p>
+    <w:p>
+      <w:pPr>
+        <w:spacing w:after="20" w:before="20"/>
+        <w:ind w:left="360"/>
+      </w:pPr>
+      <w:r>
+        <w:rPr>
+          <w:b/>
+          <w:bCs/>
+          <w:color w:val="059669"/>
+          <w:sz w:val="20"/>
+          <w:szCs w:val="20"/>
+        </w:rPr>
+        <w:t xml:space="preserve">• </w:t>
+      </w:r>
+      <w:r>
+        <w:rPr>
+          <w:sz w:val="20"/>
+          <w:szCs w:val="20"/>
+        </w:rPr>
+        <w:t xml:space="preserve">Apply strict quality verification gates before final sign-off.</w:t>
       </w:r>
     </w:p>
     <w:p>
@@ -650,14 +697,14 @@
           <w:sz w:val="19"/>
           <w:szCs w:val="19"/>
         </w:rPr>
-        <w:t xml:space="preserve">{{PRIMARY_CASE_DATA}}: </w:t>
+        <w:t xml:space="preserve">{{CORE_OPERATIONAL_PARAMETERS}}: </w:t>
       </w:r>
       <w:r>
         <w:rPr>
           <w:sz w:val="19"/>
           <w:szCs w:val="19"/>
         </w:rPr>
-        <w:t xml:space="preserve">Core operational parameters, data inputs, and constraints (Default: "Standard active case files and specifications in Fitness Coaching, Strength &amp; Conditioning.")</w:t>
+        <w:t xml:space="preserve">Primary parameters and background data (Default: "Standard operating execution in Fitness Coaching, Strength &amp; Conditioning")</w:t>
       </w:r>
     </w:p>
     <w:p>
@@ -673,14 +720,14 @@
           <w:sz w:val="19"/>
           <w:szCs w:val="19"/>
         </w:rPr>
-        <w:t xml:space="preserve">{{TARGET_OBJECTIVE}}: </w:t>
+        <w:t xml:space="preserve">{{TARGET_DELIVERABLE_SCOPE}}: </w:t>
       </w:r>
       <w:r>
         <w:rPr>
           <w:sz w:val="19"/>
           <w:szCs w:val="19"/>
         </w:rPr>
-        <w:t xml:space="preserve">Desired business outcome or deliverable specification (Default: "Construct a customized 4-day Upper/Lower progressive overload training program with volume cycling, RPE thresholds, and deload weeks.")</w:t>
+        <w:t xml:space="preserve">Scope and expected sections (Default: "Executive summary, technical breakdown, risk matrix, and execution steps")</w:t>
       </w:r>
     </w:p>
     <w:p>
@@ -696,14 +743,14 @@
           <w:sz w:val="19"/>
           <w:szCs w:val="19"/>
         </w:rPr>
-        <w:t xml:space="preserve">{{REGULATORY_STANDARD}}: </w:t>
+        <w:t xml:space="preserve">{{GOVERNING_STANDARD}}: </w:t>
       </w:r>
       <w:r>
         <w:rPr>
           <w:sz w:val="19"/>
           <w:szCs w:val="19"/>
         </w:rPr>
-        <w:t xml:space="preserve">Applicable legal or industry quality code (Default: "NASM &amp; NSCA Strength &amp; Conditioning Certified")</w:t>
+        <w:t xml:space="preserve">Governing regulatory or professional standard (Default: "NASM &amp; NSCA Strength &amp; Conditioning Certified")</w:t>
       </w:r>
     </w:p>
     <w:p>
@@ -732,22 +779,31 @@
           <w:szCs w:val="17"/>
         </w:rPr>
         <w:t xml:space="preserve">&lt;system_role&gt;
-You are an elite Master Personal Trainer &amp; Strength Coach executing a high-stakes operational workflow under NASM &amp; NSCA Strength &amp; Conditioning Certified.
+You are an expert Master Personal Trainer &amp; Strength Coach operating strictly under NASM &amp; NSCA Strength &amp; Conditioning Certified standards.
+Your objective is to produce ready-to-deploy professional work product with zero generic boilerplate.
 &lt;/system_role&gt;
-&lt;input_data&gt;
-Case Parameters: {{PRIMARY_CASE_DATA}}
-Target Objective: {{TARGET_OBJECTIVE}}
-Governing Standard: {{REGULATORY_STANDARD}}
-&lt;/input_data&gt;
-&lt;instructions&gt;
-1. Execute a comprehensive professional evaluation using established Fitness Coaching, Strength &amp; Conditioning best practices.
-2. Structure the deliverable into:
-   - Executive Brief &amp; Core Findings
-   - Technical / Analytical Deep-Dive
-   - Quantitative Metrics &amp; Risk Matrix
-   - Actionable Step-by-Step Implementation Protocol
-3. Avoid generic filler; produce ready-to-deploy, client-facing professional work product.
-&lt;/instructions&gt;</w:t>
+&lt;input_parameters&gt;
+CORE_OPERATIONAL_PARAMETERS: {{CORE_OPERATIONAL_PARAMETERS}}
+TARGET_DELIVERABLE_SCOPE: {{TARGET_DELIVERABLE_SCOPE}}
+GOVERNING_STANDARD: {{GOVERNING_STANDARD}}
+&lt;/input_parameters&gt;
+&lt;deliverable_specifications&gt;
+1. Professional Objective: Generate an end-to-end professional deliverable meeting strict NASM &amp; NSCA Strength &amp; Conditioning Certified industry standards with complete technical rigor.
+2. Governing Framework: NASM &amp; NSCA Strength &amp; Conditioning Certified
+3. Execution Steps:
+   Step 1: Ingest operational parameters and reconcile against professional guidelines.
+   Step 2: Construct executive brief and technical problem formulation.
+   Step 3: Establish quantitative metrics, risk scores, and technical controls.
+   Step 4: Develop sequential step-by-step implementation instructions.
+   Step 5: Apply strict quality verification gates before final sign-off.
+4. Strict Negative Constraints:
+   - Zero generic corporate filler or placeholder tags.
+   - All quantitative figures, standards, and references must be realistic and fully written out.
+   - If required parameters are missing, prompt for clarification rather than fabricating data.
+&lt;/deliverable_specifications&gt;
+&lt;output_formatting&gt;
+Deliver a structured, production-grade professional document with labeled sections, technical parameters, and actionable checkpoints.
+&lt;/output_formatting&gt;</w:t>
       </w:r>
     </w:p>
     <w:p>
@@ -777,19 +833,18 @@
           <w:sz w:val="18"/>
           <w:szCs w:val="18"/>
         </w:rPr>
-        <w:t xml:space="preserve">### MASTER PERSONAL TRAINER &amp; STRENGTH COACH | EXECUTIVE WORK PRODUCT SPECIFICATION
-#### 1. Strategic Appraisal &amp; Regulatory Scoping
-Under authoritative NASM &amp; NSCA Strength &amp; Conditioning Certified guidelines, the submitted operational dataset has been audited for systemic compliance, latency hazards, and risk exposure. 
-#### 2. Key Diagnostic Findings
-- **Operational Alignment:** 94.2% compliance with baseline statutory frameworks.
-- **Identified Bottlenecks:** Manual data handovers and non-standardized documentation contribute to an estimated 12 hours of weekly latency per senior practitioner.
-- **Mitigation Protocol:** Implementation of the automated multi-tier verification matrix reduces risk probability to &lt; 1.0%.
-#### 3. Execution Action Matrix
-| Phase | Action Protocol | Accountable Role | Target Standard |
-|---|---|---|---|
-| Phase 1 | Baseline Data Normalization | Lead Practitioner | NASM &amp; NSCA Strength &amp; Conditioning Certified |
-| Phase 2 | Execution &amp; Quality Control | Senior Specialist | Zero-Defect SLA |
-| Phase 3 | Final Review &amp; Archival | Managing Director | Institutional Sign-Off |</w:t>
+        <w:t xml:space="preserve">### MASTER PERSONAL TRAINER &amp; STRENGTH COACH | PRODUCTION DELIVERABLE
+**Framework:** NASM &amp; NSCA Strength &amp; Conditioning Certified | **Operating Scope:** Fitness Coaching, Strength &amp; Conditioning
+#### 1. Executive Brief &amp; Problem Statement
+The operational workflow addresses high-stakes execution within Fitness Coaching, Strength &amp; Conditioning. Primary focus is eliminating documentation friction, mitigating statutory/technical risks, and accelerating delivery turnaround by 60%.
+#### 2. Technical Analysis &amp; Implementation Matrix
+- **Core Standard:** Strict adherence to NASM &amp; NSCA Strength &amp; Conditioning Certified benchmarks.
+- **Operational Cadence:** Reduces manual preparation time from 6 hours to under 30 minutes per engagement.
+- **Verification Gate:** Lead professional sign-off required prior to institutional distribution.
+#### 3. Execution Action Plan
+1. Validate incoming baseline parameters against compliance benchmarks.
+2. Execute multi-step structured analysis with zero placeholder variables.
+3. Archive finalized artifact in organizational repository with timestamped audit trail.</w:t>
       </w:r>
     </w:p>
     <w:p>
@@ -811,7 +866,7 @@
           <w:sz w:val="18"/>
           <w:szCs w:val="18"/>
         </w:rPr>
-        <w:t xml:space="preserve">Save this prompt in your Claude Projects or ChatGPT workspace as your daily co-pilot for high-volume Fitness Coaching, Strength &amp; Conditioning tasks.</w:t>
+        <w:t xml:space="preserve">Save this prompt in your daily pinned templates to standardize team output across all Fitness Coaching, Strength &amp; Conditioning projects.</w:t>
       </w:r>
     </w:p>
     <w:p>
@@ -828,7 +883,7 @@
           <w:sz w:val="22"/>
           <w:szCs w:val="22"/>
         </w:rPr>
-        <w:t xml:space="preserve">[CER-02] Comprehensive Client Movement Assessment &amp; Corrective Exercise Plan</w:t>
+        <w:t xml:space="preserve">[CER-02] Quality Assurance &amp; Standards Compliance Audit</w:t>
       </w:r>
     </w:p>
     <w:p>
@@ -844,7 +899,7 @@
           <w:sz w:val="18"/>
           <w:szCs w:val="18"/>
         </w:rPr>
-        <w:t xml:space="preserve">Category: Risk &amp; Quality Assurance  |  Model: Claude 3.5 Sonnet  |  Complexity: Advanced  |  Tokens: ~1650</w:t>
+        <w:t xml:space="preserve">Category: Quality Control  |  Recommended Model: Claude 3.5 Sonnet  |  Complexity: Enterprise Multi-Step  |  Tokens: ~1329</w:t>
       </w:r>
     </w:p>
     <w:p>
@@ -858,14 +913,14 @@
           <w:sz w:val="20"/>
           <w:szCs w:val="20"/>
         </w:rPr>
-        <w:t xml:space="preserve">Core Business Objective: </w:t>
-      </w:r>
-      <w:r>
-        <w:rPr>
-          <w:sz w:val="20"/>
-          <w:szCs w:val="20"/>
-        </w:rPr>
-        <w:t xml:space="preserve">Evaluate overhead squat compensations, pelvic tilt, and shoulder mobility to program restorative corrective warm-ups.</w:t>
+        <w:t xml:space="preserve">Core Professional Objective: </w:t>
+      </w:r>
+      <w:r>
+        <w:rPr>
+          <w:sz w:val="20"/>
+          <w:szCs w:val="20"/>
+        </w:rPr>
+        <w:t xml:space="preserve">Execute a rigorous quality control audit benchmarking deliverables against NASM &amp; NSCA Strength &amp; Conditioning Certified criteria.</w:t>
       </w:r>
     </w:p>
     <w:p>
@@ -902,7 +957,7 @@
           <w:sz w:val="20"/>
           <w:szCs w:val="20"/>
         </w:rPr>
-        <w:t xml:space="preserve">Step 1: Rapid anomaly and liability detection.</w:t>
+        <w:t xml:space="preserve">Deconstruct audited subject against professional quality criteria.</w:t>
       </w:r>
     </w:p>
     <w:p>
@@ -925,7 +980,7 @@
           <w:sz w:val="20"/>
           <w:szCs w:val="20"/>
         </w:rPr>
-        <w:t xml:space="preserve">Step 2: Scoring against industry benchmarks.</w:t>
+        <w:t xml:space="preserve">Identify edge-case compliance defects, latency hazards, and inconsistencies.</w:t>
       </w:r>
     </w:p>
     <w:p>
@@ -948,7 +1003,30 @@
           <w:sz w:val="20"/>
           <w:szCs w:val="20"/>
         </w:rPr>
-        <w:t xml:space="preserve">Step 3: Corrective action memorandum drafting.</w:t>
+        <w:t xml:space="preserve">Assign benchmarked severity ratings (Low, Moderate, High, Critical).</w:t>
+      </w:r>
+    </w:p>
+    <w:p>
+      <w:pPr>
+        <w:spacing w:after="20" w:before="20"/>
+        <w:ind w:left="360"/>
+      </w:pPr>
+      <w:r>
+        <w:rPr>
+          <w:b/>
+          <w:bCs/>
+          <w:color w:val="059669"/>
+          <w:sz w:val="20"/>
+          <w:szCs w:val="20"/>
+        </w:rPr>
+        <w:t xml:space="preserve">• </w:t>
+      </w:r>
+      <w:r>
+        <w:rPr>
+          <w:sz w:val="20"/>
+          <w:szCs w:val="20"/>
+        </w:rPr>
+        <w:t xml:space="preserve">Prescribe immediate remedial corrections and preventative workflow controls.</w:t>
       </w:r>
     </w:p>
     <w:p>
@@ -978,14 +1056,14 @@
           <w:sz w:val="19"/>
           <w:szCs w:val="19"/>
         </w:rPr>
-        <w:t xml:space="preserve">{{AUDIT_SUBJECT}}: </w:t>
+        <w:t xml:space="preserve">{{AUDIT_SUBJECT_DATA}}: </w:t>
       </w:r>
       <w:r>
         <w:rPr>
           <w:sz w:val="19"/>
           <w:szCs w:val="19"/>
         </w:rPr>
-        <w:t xml:space="preserve">Matter, contract, or client situation to review (Default: "Active client case and operational parameters in Fitness Coaching, Strength &amp; Conditioning.")</w:t>
+        <w:t xml:space="preserve">Work product or workflow subject to audit (Default: "Production artifact in Fitness Coaching, Strength &amp; Conditioning")</w:t>
       </w:r>
     </w:p>
     <w:p>
@@ -1001,14 +1079,14 @@
           <w:sz w:val="19"/>
           <w:szCs w:val="19"/>
         </w:rPr>
-        <w:t xml:space="preserve">{{RISK_TOLERANCE}}: </w:t>
+        <w:t xml:space="preserve">{{RISK_TOLERANCE_LEVEL}}: </w:t>
       </w:r>
       <w:r>
         <w:rPr>
           <w:sz w:val="19"/>
           <w:szCs w:val="19"/>
         </w:rPr>
-        <w:t xml:space="preserve">Institutional risk threshold (Default: "Strict / Zero-Tolerance")</w:t>
+        <w:t xml:space="preserve">Strictness of compliance review (Default: "Zero-Defect / Strict Standard")</w:t>
       </w:r>
     </w:p>
     <w:p>
@@ -1037,19 +1115,29 @@
           <w:szCs w:val="17"/>
         </w:rPr>
         <w:t xml:space="preserve">&lt;system_role&gt;
-You are an expert Master Personal Trainer &amp; Strength Coach performing an urgent quality assurance and risk audit.
+You are an expert Master Personal Trainer &amp; Strength Coach operating strictly under NASM &amp; NSCA Strength &amp; Conditioning Certified standards.
+Your objective is to produce ready-to-deploy professional work product with zero generic boilerplate.
 &lt;/system_role&gt;
-&lt;audit_input&gt;
-Subject: {{AUDIT_SUBJECT}}
-Tolerance: {{RISK_TOLERANCE}}
-Standard: NASM &amp; NSCA Strength &amp; Conditioning Certified
-&lt;/audit_input&gt;
-&lt;output_format&gt;
-Deliver an urgent Risk Triage Memo:
-1. Critical Vulnerability Summary
-2. Benchmarked Risk Rating (Low / Moderate / Severe)
-3. Immediate Corrective Interventions
-&lt;/output_format&gt;</w:t>
+&lt;input_parameters&gt;
+AUDIT_SUBJECT_DATA: {{AUDIT_SUBJECT_DATA}}
+RISK_TOLERANCE_LEVEL: {{RISK_TOLERANCE_LEVEL}}
+&lt;/input_parameters&gt;
+&lt;deliverable_specifications&gt;
+1. Professional Objective: Execute a rigorous quality control audit benchmarking deliverables against NASM &amp; NSCA Strength &amp; Conditioning Certified criteria.
+2. Governing Framework: NASM &amp; NSCA Strength &amp; Conditioning Certified
+3. Execution Steps:
+   Step 1: Deconstruct audited subject against professional quality criteria.
+   Step 2: Identify edge-case compliance defects, latency hazards, and inconsistencies.
+   Step 3: Assign benchmarked severity ratings (Low, Moderate, High, Critical).
+   Step 4: Prescribe immediate remedial corrections and preventative workflow controls.
+4. Strict Negative Constraints:
+   - Zero generic corporate filler or placeholder tags.
+   - All quantitative figures, standards, and references must be realistic and fully written out.
+   - If required parameters are missing, prompt for clarification rather than fabricating data.
+&lt;/deliverable_specifications&gt;
+&lt;output_formatting&gt;
+Deliver a structured, production-grade professional document with labeled sections, technical parameters, and actionable checkpoints.
+&lt;/output_formatting&gt;</w:t>
       </w:r>
     </w:p>
     <w:p>
@@ -1079,11 +1167,14 @@
           <w:sz w:val="18"/>
           <w:szCs w:val="18"/>
         </w:rPr>
-        <w:t xml:space="preserve">### RISK TRIAGE &amp; QUALITY AUDIT REPORT
-**COMPLIANCE STANDARD:** NASM &amp; NSCA Strength &amp; Conditioning Certified
-1. **Executive Vulnerability Summary:** Audited operational protocols identified zero catastrophic statutory breaches, but revealed workflow friction in documentation cadence.
-2. **Risk Rating: LOW-MODERATE.** Systemic controls are robust, requiring only minor standardization of intake parameters.
-3. **Corrective Action Plan:** Deploy standardized validation gates prior to final client sign-off.</w:t>
+        <w:t xml:space="preserve">### QUALITY ASSURANCE AUDIT REPORT
+**Audited Against:** NASM &amp; NSCA Strength &amp; Conditioning Certified | **Severity Assessment:** High Precision
+#### 1. Executive Vulnerability Summary
+Audited operational materials exhibit 96.4% baseline conformity. Identified friction points involve non-standardized intake documentation and missing verification sign-offs.
+#### 2. Diagnostic Inspection Findings
+- High-Priority: Incomplete cross-referencing of governing guidelines in secondary appendices.
+- Moderate: Latency in inter-departmental handoffs contributing to 3-4 hours of preventable delay.
+- Remediation: Enforce standardized prompt intake gates and mandatory peer review prior to release.</w:t>
       </w:r>
     </w:p>
     <w:p>
@@ -1105,45 +1196,13 @@
           <w:sz w:val="18"/>
           <w:szCs w:val="18"/>
         </w:rPr>
-        <w:t xml:space="preserve">Run incoming client materials through this prompt before commencing billable execution.</w:t>
-      </w:r>
-    </w:p>
-    <w:p>
-      <w:pPr>
-        <w:pStyle w:val="Heading1"/>
-        <w:pageBreakBefore/>
-        <w:spacing w:after="180" w:before="240"/>
-      </w:pPr>
-      <w:r>
-        <w:rPr>
-          <w:rFonts w:ascii="Calibri" w:cs="Calibri" w:eastAsia="Calibri" w:hAnsi="Calibri"/>
-          <w:b/>
-          <w:bCs/>
-          <w:color w:val="0F172A"/>
-          <w:sz w:val="26"/>
-          <w:szCs w:val="26"/>
-        </w:rPr>
-        <w:t xml:space="preserve">PART V: CLAUDE PROJECT KNOWLEDGE BASE TRANSCRIPTS</w:t>
-      </w:r>
-    </w:p>
-    <w:p>
-      <w:pPr>
-        <w:spacing w:after="180" w:before="60"/>
-      </w:pPr>
-      <w:r>
-        <w:rPr>
-          <w:rFonts w:ascii="Calibri" w:cs="Calibri" w:eastAsia="Calibri" w:hAnsi="Calibri"/>
-          <w:color w:val="475569"/>
-          <w:sz w:val="20"/>
-          <w:szCs w:val="20"/>
-        </w:rPr>
-        <w:t xml:space="preserve">Upload these institutional knowledge files into the "Project Knowledge" section of Claude Projects to equip the model with domain reference standards.</w:t>
+        <w:t xml:space="preserve">Run this prompt on all incoming team deliverables before delivering final work products to external stakeholders.</w:t>
       </w:r>
     </w:p>
     <w:p>
       <w:pPr>
         <w:pStyle w:val="Heading2"/>
-        <w:spacing w:after="60" w:before="240"/>
+        <w:spacing w:after="60" w:before="280"/>
       </w:pPr>
       <w:r>
         <w:rPr>
@@ -1154,27 +1213,252 @@
           <w:sz w:val="22"/>
           <w:szCs w:val="22"/>
         </w:rPr>
-        <w:t xml:space="preserve">File: certified-personal-trainer_operating_standard.md</w:t>
-      </w:r>
-    </w:p>
-    <w:p>
-      <w:pPr>
-        <w:spacing w:after="60" w:before="0"/>
-      </w:pPr>
-      <w:r>
-        <w:rPr>
-          <w:i/>
-          <w:iCs/>
+        <w:t xml:space="preserve">[CER-03] High-Stakes Stakeholder Briefing &amp; Strategic Correspondence</w:t>
+      </w:r>
+    </w:p>
+    <w:p>
+      <w:pPr>
+        <w:spacing w:after="80" w:before="0"/>
+      </w:pPr>
+      <w:r>
+        <w:rPr>
+          <w:rFonts w:ascii="Calibri" w:cs="Calibri" w:eastAsia="Calibri" w:hAnsi="Calibri"/>
+          <w:b/>
+          <w:bCs/>
           <w:color w:val="059669"/>
           <w:sz w:val="18"/>
           <w:szCs w:val="18"/>
         </w:rPr>
-        <w:t xml:space="preserve">Purpose: Institutional knowledge file for Master Personal Trainer &amp; Strength Coach Claude Project.</w:t>
-      </w:r>
-    </w:p>
-    <w:p>
-      <w:pPr>
-        <w:spacing w:after="160" w:before="20"/>
+        <w:t xml:space="preserve">Category: Stakeholder Communications  |  Recommended Model: Claude 3.5 Sonnet  |  Complexity: Advanced  |  Tokens: ~1498</w:t>
+      </w:r>
+    </w:p>
+    <w:p>
+      <w:pPr>
+        <w:spacing w:after="40" w:before="40"/>
+      </w:pPr>
+      <w:r>
+        <w:rPr>
+          <w:b/>
+          <w:bCs/>
+          <w:sz w:val="20"/>
+          <w:szCs w:val="20"/>
+        </w:rPr>
+        <w:t xml:space="preserve">Core Professional Objective: </w:t>
+      </w:r>
+      <w:r>
+        <w:rPr>
+          <w:sz w:val="20"/>
+          <w:szCs w:val="20"/>
+        </w:rPr>
+        <w:t xml:space="preserve">Structure clear, persuasive, and transparent correspondence communicating critical developments or negotiations under NASM &amp; NSCA Strength &amp; Conditioning Certified.</w:t>
+      </w:r>
+    </w:p>
+    <w:p>
+      <w:pPr>
+        <w:spacing w:after="40" w:before="60"/>
+      </w:pPr>
+      <w:r>
+        <w:rPr>
+          <w:b/>
+          <w:bCs/>
+          <w:sz w:val="20"/>
+          <w:szCs w:val="20"/>
+        </w:rPr>
+        <w:t xml:space="preserve">Sequential Execution Steps:</w:t>
+      </w:r>
+    </w:p>
+    <w:p>
+      <w:pPr>
+        <w:spacing w:after="20" w:before="20"/>
+        <w:ind w:left="360"/>
+      </w:pPr>
+      <w:r>
+        <w:rPr>
+          <w:b/>
+          <w:bCs/>
+          <w:color w:val="059669"/>
+          <w:sz w:val="20"/>
+          <w:szCs w:val="20"/>
+        </w:rPr>
+        <w:t xml:space="preserve">• </w:t>
+      </w:r>
+      <w:r>
+        <w:rPr>
+          <w:sz w:val="20"/>
+          <w:szCs w:val="20"/>
+        </w:rPr>
+        <w:t xml:space="preserve">Executive Summary: State the bottom-line situation in the opening paragraph.</w:t>
+      </w:r>
+    </w:p>
+    <w:p>
+      <w:pPr>
+        <w:spacing w:after="20" w:before="20"/>
+        <w:ind w:left="360"/>
+      </w:pPr>
+      <w:r>
+        <w:rPr>
+          <w:b/>
+          <w:bCs/>
+          <w:color w:val="059669"/>
+          <w:sz w:val="20"/>
+          <w:szCs w:val="20"/>
+        </w:rPr>
+        <w:t xml:space="preserve">• </w:t>
+      </w:r>
+      <w:r>
+        <w:rPr>
+          <w:sz w:val="20"/>
+          <w:szCs w:val="20"/>
+        </w:rPr>
+        <w:t xml:space="preserve">Context &amp; Contributing Factors: Objectively detail facts and constraints.</w:t>
+      </w:r>
+    </w:p>
+    <w:p>
+      <w:pPr>
+        <w:spacing w:after="20" w:before="20"/>
+        <w:ind w:left="360"/>
+      </w:pPr>
+      <w:r>
+        <w:rPr>
+          <w:b/>
+          <w:bCs/>
+          <w:color w:val="059669"/>
+          <w:sz w:val="20"/>
+          <w:szCs w:val="20"/>
+        </w:rPr>
+        <w:t xml:space="preserve">• </w:t>
+      </w:r>
+      <w:r>
+        <w:rPr>
+          <w:sz w:val="20"/>
+          <w:szCs w:val="20"/>
+        </w:rPr>
+        <w:t xml:space="preserve">Impact Assessment: Outline timeline, financial, or operational parameters.</w:t>
+      </w:r>
+    </w:p>
+    <w:p>
+      <w:pPr>
+        <w:spacing w:after="20" w:before="20"/>
+        <w:ind w:left="360"/>
+      </w:pPr>
+      <w:r>
+        <w:rPr>
+          <w:b/>
+          <w:bCs/>
+          <w:color w:val="059669"/>
+          <w:sz w:val="20"/>
+          <w:szCs w:val="20"/>
+        </w:rPr>
+        <w:t xml:space="preserve">• </w:t>
+      </w:r>
+      <w:r>
+        <w:rPr>
+          <w:sz w:val="20"/>
+          <w:szCs w:val="20"/>
+        </w:rPr>
+        <w:t xml:space="preserve">Actionable Proposal: Provide 2 clear paths forward with concrete recommendations.</w:t>
+      </w:r>
+    </w:p>
+    <w:p>
+      <w:pPr>
+        <w:spacing w:after="40" w:before="60"/>
+      </w:pPr>
+      <w:r>
+        <w:rPr>
+          <w:b/>
+          <w:bCs/>
+          <w:sz w:val="20"/>
+          <w:szCs w:val="20"/>
+        </w:rPr>
+        <w:t xml:space="preserve">Input Variables &amp; Parameters:</w:t>
+      </w:r>
+    </w:p>
+    <w:p>
+      <w:pPr>
+        <w:spacing w:after="20" w:before="20"/>
+        <w:ind w:left="360"/>
+      </w:pPr>
+      <w:r>
+        <w:rPr>
+          <w:b/>
+          <w:bCs/>
+          <w:color w:val="B45309"/>
+          <w:sz w:val="19"/>
+          <w:szCs w:val="19"/>
+        </w:rPr>
+        <w:t xml:space="preserve">{{STAKEHOLDER_COUNTERPARTY}}: </w:t>
+      </w:r>
+      <w:r>
+        <w:rPr>
+          <w:sz w:val="19"/>
+          <w:szCs w:val="19"/>
+        </w:rPr>
+        <w:t xml:space="preserve">Recipient identity and key concerns (Default: "Primary stakeholder in Fitness Coaching, Strength &amp; Conditioning")</w:t>
+      </w:r>
+    </w:p>
+    <w:p>
+      <w:pPr>
+        <w:spacing w:after="20" w:before="20"/>
+        <w:ind w:left="360"/>
+      </w:pPr>
+      <w:r>
+        <w:rPr>
+          <w:b/>
+          <w:bCs/>
+          <w:color w:val="B45309"/>
+          <w:sz w:val="19"/>
+          <w:szCs w:val="19"/>
+        </w:rPr>
+        <w:t xml:space="preserve">{{CORE_DEVELOPMENT_EVENT}}: </w:t>
+      </w:r>
+      <w:r>
+        <w:rPr>
+          <w:sz w:val="19"/>
+          <w:szCs w:val="19"/>
+        </w:rPr>
+        <w:t xml:space="preserve">The critical event or update to convey (Default: "Operational progress update and variance alignment")</w:t>
+      </w:r>
+    </w:p>
+    <w:p>
+      <w:pPr>
+        <w:spacing w:after="20" w:before="20"/>
+        <w:ind w:left="360"/>
+      </w:pPr>
+      <w:r>
+        <w:rPr>
+          <w:b/>
+          <w:bCs/>
+          <w:color w:val="B45309"/>
+          <w:sz w:val="19"/>
+          <w:szCs w:val="19"/>
+        </w:rPr>
+        <w:t xml:space="preserve">{{PROPOSED_RESOLUTION_TERMS}}: </w:t>
+      </w:r>
+      <w:r>
+        <w:rPr>
+          <w:sz w:val="19"/>
+          <w:szCs w:val="19"/>
+        </w:rPr>
+        <w:t xml:space="preserve">Proposed next steps and call-to-action (Default: "Structured review meeting and alignment on milestones")</w:t>
+      </w:r>
+    </w:p>
+    <w:p>
+      <w:pPr>
+        <w:spacing w:after="40" w:before="80"/>
+      </w:pPr>
+      <w:r>
+        <w:rPr>
+          <w:b/>
+          <w:bCs/>
+          <w:sz w:val="20"/>
+          <w:szCs w:val="20"/>
+        </w:rPr>
+        <w:t xml:space="preserve">Production Prompt Template (XML):</w:t>
+      </w:r>
+    </w:p>
+    <w:p>
+      <w:pPr>
+        <w:spacing w:after="80" w:before="20"/>
       </w:pPr>
       <w:r>
         <w:rPr>
@@ -1183,9 +1467,807 @@
           <w:sz w:val="17"/>
           <w:szCs w:val="17"/>
         </w:rPr>
-        <w:t xml:space="preserve"># Master Personal Trainer &amp; Strength Coach Operating Baseline
-Governed under NASM &amp; NSCA Strength &amp; Conditioning Certified.
-Mandate strict adherence to industry best practices and quantitative accountability.</w:t>
+        <w:t xml:space="preserve">&lt;system_role&gt;
+You are an expert Master Personal Trainer &amp; Strength Coach operating strictly under NASM &amp; NSCA Strength &amp; Conditioning Certified standards.
+Your objective is to produce ready-to-deploy professional work product with zero generic boilerplate.
+&lt;/system_role&gt;
+&lt;input_parameters&gt;
+STAKEHOLDER_COUNTERPARTY: {{STAKEHOLDER_COUNTERPARTY}}
+CORE_DEVELOPMENT_EVENT: {{CORE_DEVELOPMENT_EVENT}}
+PROPOSED_RESOLUTION_TERMS: {{PROPOSED_RESOLUTION_TERMS}}
+&lt;/input_parameters&gt;
+&lt;deliverable_specifications&gt;
+1. Professional Objective: Structure clear, persuasive, and transparent correspondence communicating critical developments or negotiations under NASM &amp; NSCA Strength &amp; Conditioning Certified.
+2. Governing Framework: NASM &amp; NSCA Strength &amp; Conditioning Certified
+3. Execution Steps:
+   Step 1: Executive Summary: State the bottom-line situation in the opening paragraph.
+   Step 2: Context &amp; Contributing Factors: Objectively detail facts and constraints.
+   Step 3: Impact Assessment: Outline timeline, financial, or operational parameters.
+   Step 4: Actionable Proposal: Provide 2 clear paths forward with concrete recommendations.
+4. Strict Negative Constraints:
+   - Zero generic corporate filler or placeholder tags.
+   - All quantitative figures, standards, and references must be realistic and fully written out.
+   - If required parameters are missing, prompt for clarification rather than fabricating data.
+&lt;/deliverable_specifications&gt;
+&lt;output_formatting&gt;
+Deliver a structured, production-grade professional document with labeled sections, technical parameters, and actionable checkpoints.
+&lt;/output_formatting&gt;</w:t>
+      </w:r>
+    </w:p>
+    <w:p>
+      <w:pPr>
+        <w:spacing w:after="40" w:before="60"/>
+      </w:pPr>
+      <w:r>
+        <w:rPr>
+          <w:b/>
+          <w:bCs/>
+          <w:sz w:val="19"/>
+          <w:szCs w:val="19"/>
+        </w:rPr>
+        <w:t xml:space="preserve">Verified Work Product Sample Output: </w:t>
+      </w:r>
+    </w:p>
+    <w:p>
+      <w:pPr>
+        <w:spacing w:after="120" w:before="20"/>
+      </w:pPr>
+      <w:r>
+        <w:rPr>
+          <w:rFonts w:ascii="Calibri" w:cs="Calibri" w:eastAsia="Calibri" w:hAnsi="Calibri"/>
+          <w:i/>
+          <w:iCs/>
+          <w:color w:val="475569"/>
+          <w:sz w:val="18"/>
+          <w:szCs w:val="18"/>
+        </w:rPr>
+        <w:t xml:space="preserve">### STRATEGIC PROFESSIONAL CORRESPONDENCE
+**Subject:** Operational Update &amp; Milestone Progression Alignment
+Dear Project Leadership,
+I am writing to provide a transparent progress briefing on our active operations within Fitness Coaching, Strength &amp; Conditioning, highlighting both core milestone completions and strategic adjustments to ensure 100% adherence to NASM &amp; NSCA Strength &amp; Conditioning Certified standards.
+#### 1. Key Accomplishments to Date
+Over the preceding operational cycle, our team completed 92% of scheduled deliverables on or ahead of schedule, with quality benchmarks exceeding target SLAs.
+#### 2. Recommended Path Forward
+We recommend proceeding with Plan A: deploying our automated verification gates, which preserves our delivery timeline while guaranteeing complete statutory and technical compliance.
+Sincerely,
+[Lead Professional Title]</w:t>
+      </w:r>
+    </w:p>
+    <w:p>
+      <w:pPr>
+        <w:spacing w:after="200" w:before="40"/>
+      </w:pPr>
+      <w:r>
+        <w:rPr>
+          <w:b/>
+          <w:bCs/>
+          <w:color w:val="059669"/>
+          <w:sz w:val="18"/>
+          <w:szCs w:val="18"/>
+        </w:rPr>
+        <w:t xml:space="preserve">Implementation Pro Tip: </w:t>
+      </w:r>
+      <w:r>
+        <w:rPr>
+          <w:sz w:val="18"/>
+          <w:szCs w:val="18"/>
+        </w:rPr>
+        <w:t xml:space="preserve">Always provide a recommended path forward in paragraph 3 to guide decisive stakeholder consensus.</w:t>
+      </w:r>
+    </w:p>
+    <w:p>
+      <w:pPr>
+        <w:pStyle w:val="Heading2"/>
+        <w:spacing w:after="60" w:before="280"/>
+      </w:pPr>
+      <w:r>
+        <w:rPr>
+          <w:rFonts w:ascii="Calibri" w:cs="Calibri" w:eastAsia="Calibri" w:hAnsi="Calibri"/>
+          <w:b/>
+          <w:bCs/>
+          <w:color w:val="0F172A"/>
+          <w:sz w:val="22"/>
+          <w:szCs w:val="22"/>
+        </w:rPr>
+        <w:t xml:space="preserve">[CER-04] Emergency Incident Triage &amp; Corrective Action Protocol</w:t>
+      </w:r>
+    </w:p>
+    <w:p>
+      <w:pPr>
+        <w:spacing w:after="80" w:before="0"/>
+      </w:pPr>
+      <w:r>
+        <w:rPr>
+          <w:rFonts w:ascii="Calibri" w:cs="Calibri" w:eastAsia="Calibri" w:hAnsi="Calibri"/>
+          <w:b/>
+          <w:bCs/>
+          <w:color w:val="059669"/>
+          <w:sz w:val="18"/>
+          <w:szCs w:val="18"/>
+        </w:rPr>
+        <w:t xml:space="preserve">Category: Incident &amp; Risk Triage  |  Recommended Model: Claude 3.5 Sonnet  |  Complexity: Advanced  |  Tokens: ~1693</w:t>
+      </w:r>
+    </w:p>
+    <w:p>
+      <w:pPr>
+        <w:spacing w:after="40" w:before="40"/>
+      </w:pPr>
+      <w:r>
+        <w:rPr>
+          <w:b/>
+          <w:bCs/>
+          <w:sz w:val="20"/>
+          <w:szCs w:val="20"/>
+        </w:rPr>
+        <w:t xml:space="preserve">Core Professional Objective: </w:t>
+      </w:r>
+      <w:r>
+        <w:rPr>
+          <w:sz w:val="20"/>
+          <w:szCs w:val="20"/>
+        </w:rPr>
+        <w:t xml:space="preserve">Formulate an immediate, structured response to acute operational failures, disputes, or hazards under NASM &amp; NSCA Strength &amp; Conditioning Certified.</w:t>
+      </w:r>
+    </w:p>
+    <w:p>
+      <w:pPr>
+        <w:spacing w:after="40" w:before="60"/>
+      </w:pPr>
+      <w:r>
+        <w:rPr>
+          <w:b/>
+          <w:bCs/>
+          <w:sz w:val="20"/>
+          <w:szCs w:val="20"/>
+        </w:rPr>
+        <w:t xml:space="preserve">Sequential Execution Steps:</w:t>
+      </w:r>
+    </w:p>
+    <w:p>
+      <w:pPr>
+        <w:spacing w:after="20" w:before="20"/>
+        <w:ind w:left="360"/>
+      </w:pPr>
+      <w:r>
+        <w:rPr>
+          <w:b/>
+          <w:bCs/>
+          <w:color w:val="059669"/>
+          <w:sz w:val="20"/>
+          <w:szCs w:val="20"/>
+        </w:rPr>
+        <w:t xml:space="preserve">• </w:t>
+      </w:r>
+      <w:r>
+        <w:rPr>
+          <w:sz w:val="20"/>
+          <w:szCs w:val="20"/>
+        </w:rPr>
+        <w:t xml:space="preserve">Incident Classification: Triage severity rating and determine immediate containment actions.</w:t>
+      </w:r>
+    </w:p>
+    <w:p>
+      <w:pPr>
+        <w:spacing w:after="20" w:before="20"/>
+        <w:ind w:left="360"/>
+      </w:pPr>
+      <w:r>
+        <w:rPr>
+          <w:b/>
+          <w:bCs/>
+          <w:color w:val="059669"/>
+          <w:sz w:val="20"/>
+          <w:szCs w:val="20"/>
+        </w:rPr>
+        <w:t xml:space="preserve">• </w:t>
+      </w:r>
+      <w:r>
+        <w:rPr>
+          <w:sz w:val="20"/>
+          <w:szCs w:val="20"/>
+        </w:rPr>
+        <w:t xml:space="preserve">Root Cause Hypothesis: Isolate procedural or technical failure points.</w:t>
+      </w:r>
+    </w:p>
+    <w:p>
+      <w:pPr>
+        <w:spacing w:after="20" w:before="20"/>
+        <w:ind w:left="360"/>
+      </w:pPr>
+      <w:r>
+        <w:rPr>
+          <w:b/>
+          <w:bCs/>
+          <w:color w:val="059669"/>
+          <w:sz w:val="20"/>
+          <w:szCs w:val="20"/>
+        </w:rPr>
+        <w:t xml:space="preserve">• </w:t>
+      </w:r>
+      <w:r>
+        <w:rPr>
+          <w:sz w:val="20"/>
+          <w:szCs w:val="20"/>
+        </w:rPr>
+        <w:t xml:space="preserve">Remediation Playbook: Execute step-by-step containment and corrective protocols.</w:t>
+      </w:r>
+    </w:p>
+    <w:p>
+      <w:pPr>
+        <w:spacing w:after="20" w:before="20"/>
+        <w:ind w:left="360"/>
+      </w:pPr>
+      <w:r>
+        <w:rPr>
+          <w:b/>
+          <w:bCs/>
+          <w:color w:val="059669"/>
+          <w:sz w:val="20"/>
+          <w:szCs w:val="20"/>
+        </w:rPr>
+        <w:t xml:space="preserve">• </w:t>
+      </w:r>
+      <w:r>
+        <w:rPr>
+          <w:sz w:val="20"/>
+          <w:szCs w:val="20"/>
+        </w:rPr>
+        <w:t xml:space="preserve">Stakeholder Notification &amp; Post-Incident Archival: Draft mandatory compliance logs.</w:t>
+      </w:r>
+    </w:p>
+    <w:p>
+      <w:pPr>
+        <w:spacing w:after="40" w:before="60"/>
+      </w:pPr>
+      <w:r>
+        <w:rPr>
+          <w:b/>
+          <w:bCs/>
+          <w:sz w:val="20"/>
+          <w:szCs w:val="20"/>
+        </w:rPr>
+        <w:t xml:space="preserve">Input Variables &amp; Parameters:</w:t>
+      </w:r>
+    </w:p>
+    <w:p>
+      <w:pPr>
+        <w:spacing w:after="20" w:before="20"/>
+        <w:ind w:left="360"/>
+      </w:pPr>
+      <w:r>
+        <w:rPr>
+          <w:b/>
+          <w:bCs/>
+          <w:color w:val="B45309"/>
+          <w:sz w:val="19"/>
+          <w:szCs w:val="19"/>
+        </w:rPr>
+        <w:t xml:space="preserve">{{INCIDENT_DESCRIPTION}}: </w:t>
+      </w:r>
+      <w:r>
+        <w:rPr>
+          <w:sz w:val="19"/>
+          <w:szCs w:val="19"/>
+        </w:rPr>
+        <w:t xml:space="preserve">Urgent failure or risk event (Default: "Unexpected operational variance in Fitness Coaching, Strength &amp; Conditioning")</w:t>
+      </w:r>
+    </w:p>
+    <w:p>
+      <w:pPr>
+        <w:spacing w:after="20" w:before="20"/>
+        <w:ind w:left="360"/>
+      </w:pPr>
+      <w:r>
+        <w:rPr>
+          <w:b/>
+          <w:bCs/>
+          <w:color w:val="B45309"/>
+          <w:sz w:val="19"/>
+          <w:szCs w:val="19"/>
+        </w:rPr>
+        <w:t xml:space="preserve">{{IMMEDIATE_EXPOSURE}}: </w:t>
+      </w:r>
+      <w:r>
+        <w:rPr>
+          <w:sz w:val="19"/>
+          <w:szCs w:val="19"/>
+        </w:rPr>
+        <w:t xml:space="preserve">Potential financial, safety, or compliance fallout (Default: "Potential operational downtime and statutory compliance breach")</w:t>
+      </w:r>
+    </w:p>
+    <w:p>
+      <w:pPr>
+        <w:spacing w:after="20" w:before="20"/>
+        <w:ind w:left="360"/>
+      </w:pPr>
+      <w:r>
+        <w:rPr>
+          <w:b/>
+          <w:bCs/>
+          <w:color w:val="B45309"/>
+          <w:sz w:val="19"/>
+          <w:szCs w:val="19"/>
+        </w:rPr>
+        <w:t xml:space="preserve">{{ISOLATION_MEASURES}}: </w:t>
+      </w:r>
+      <w:r>
+        <w:rPr>
+          <w:sz w:val="19"/>
+          <w:szCs w:val="19"/>
+        </w:rPr>
+        <w:t xml:space="preserve">First-response containment steps already taken (Default: "Work halted and containment measures initiated")</w:t>
+      </w:r>
+    </w:p>
+    <w:p>
+      <w:pPr>
+        <w:spacing w:after="40" w:before="80"/>
+      </w:pPr>
+      <w:r>
+        <w:rPr>
+          <w:b/>
+          <w:bCs/>
+          <w:sz w:val="20"/>
+          <w:szCs w:val="20"/>
+        </w:rPr>
+        <w:t xml:space="preserve">Production Prompt Template (XML):</w:t>
+      </w:r>
+    </w:p>
+    <w:p>
+      <w:pPr>
+        <w:spacing w:after="80" w:before="20"/>
+      </w:pPr>
+      <w:r>
+        <w:rPr>
+          <w:rFonts w:ascii="Courier New" w:cs="Courier New" w:eastAsia="Courier New" w:hAnsi="Courier New"/>
+          <w:color w:val="1E293B"/>
+          <w:sz w:val="17"/>
+          <w:szCs w:val="17"/>
+        </w:rPr>
+        <w:t xml:space="preserve">&lt;system_role&gt;
+You are an expert Master Personal Trainer &amp; Strength Coach operating strictly under NASM &amp; NSCA Strength &amp; Conditioning Certified standards.
+Your objective is to produce ready-to-deploy professional work product with zero generic boilerplate.
+&lt;/system_role&gt;
+&lt;input_parameters&gt;
+INCIDENT_DESCRIPTION: {{INCIDENT_DESCRIPTION}}
+IMMEDIATE_EXPOSURE: {{IMMEDIATE_EXPOSURE}}
+ISOLATION_MEASURES: {{ISOLATION_MEASURES}}
+&lt;/input_parameters&gt;
+&lt;deliverable_specifications&gt;
+1. Professional Objective: Formulate an immediate, structured response to acute operational failures, disputes, or hazards under NASM &amp; NSCA Strength &amp; Conditioning Certified.
+2. Governing Framework: NASM &amp; NSCA Strength &amp; Conditioning Certified
+3. Execution Steps:
+   Step 1: Incident Classification: Triage severity rating and determine immediate containment actions.
+   Step 2: Root Cause Hypothesis: Isolate procedural or technical failure points.
+   Step 3: Remediation Playbook: Execute step-by-step containment and corrective protocols.
+   Step 4: Stakeholder Notification &amp; Post-Incident Archival: Draft mandatory compliance logs.
+4. Strict Negative Constraints:
+   - Zero generic corporate filler or placeholder tags.
+   - All quantitative figures, standards, and references must be realistic and fully written out.
+   - If required parameters are missing, prompt for clarification rather than fabricating data.
+&lt;/deliverable_specifications&gt;
+&lt;output_formatting&gt;
+Deliver a structured, production-grade professional document with labeled sections, technical parameters, and actionable checkpoints.
+&lt;/output_formatting&gt;</w:t>
+      </w:r>
+    </w:p>
+    <w:p>
+      <w:pPr>
+        <w:spacing w:after="40" w:before="60"/>
+      </w:pPr>
+      <w:r>
+        <w:rPr>
+          <w:b/>
+          <w:bCs/>
+          <w:sz w:val="19"/>
+          <w:szCs w:val="19"/>
+        </w:rPr>
+        <w:t xml:space="preserve">Verified Work Product Sample Output: </w:t>
+      </w:r>
+    </w:p>
+    <w:p>
+      <w:pPr>
+        <w:spacing w:after="120" w:before="20"/>
+      </w:pPr>
+      <w:r>
+        <w:rPr>
+          <w:rFonts w:ascii="Calibri" w:cs="Calibri" w:eastAsia="Calibri" w:hAnsi="Calibri"/>
+          <w:i/>
+          <w:iCs/>
+          <w:color w:val="475569"/>
+          <w:sz w:val="18"/>
+          <w:szCs w:val="18"/>
+        </w:rPr>
+        <w:t xml:space="preserve">### INCIDENT REMEDIATION &amp; ROOT-CAUSE TRIAGE REPORT
+**Event Severity:** SEV-1 Urgent | **Standard:** NASM &amp; NSCA Strength &amp; Conditioning Certified
+#### 1. Executive Incident Summary
+At 09:15 UTC, an unexpected procedural variance occurred during live execution in Fitness Coaching, Strength &amp; Conditioning. Immediate containment protocols were initiated within 4 minutes, preventing secondary cascade damage.
+#### 2. Root Cause Analysis
+- **Direct Cause:** Failure of automated validation handoff prior to secondary stage execution.
+- **Systemic Factor:** Unsynchronized version dependencies in template parameter configurations.
+#### 3. Corrective Action Plan
+1. Isolate compromised workflow segment and restore from verified clean checkpoint.
+2. Implement automated pre-flight parameter verification rule.
+3. Conduct post-incident debrief within 24 hours to update permanent operational SOPs.</w:t>
+      </w:r>
+    </w:p>
+    <w:p>
+      <w:pPr>
+        <w:spacing w:after="200" w:before="40"/>
+      </w:pPr>
+      <w:r>
+        <w:rPr>
+          <w:b/>
+          <w:bCs/>
+          <w:color w:val="059669"/>
+          <w:sz w:val="18"/>
+          <w:szCs w:val="18"/>
+        </w:rPr>
+        <w:t xml:space="preserve">Implementation Pro Tip: </w:t>
+      </w:r>
+      <w:r>
+        <w:rPr>
+          <w:sz w:val="18"/>
+          <w:szCs w:val="18"/>
+        </w:rPr>
+        <w:t xml:space="preserve">Archive all incident logs with exact timestamps to establish defensible due diligence during compliance audits.</w:t>
+      </w:r>
+    </w:p>
+    <w:p>
+      <w:pPr>
+        <w:pStyle w:val="Heading2"/>
+        <w:spacing w:after="60" w:before="280"/>
+      </w:pPr>
+      <w:r>
+        <w:rPr>
+          <w:rFonts w:ascii="Calibri" w:cs="Calibri" w:eastAsia="Calibri" w:hAnsi="Calibri"/>
+          <w:b/>
+          <w:bCs/>
+          <w:color w:val="0F172A"/>
+          <w:sz w:val="22"/>
+          <w:szCs w:val="22"/>
+        </w:rPr>
+        <w:t xml:space="preserve">[CER-05] Standard Operating Procedure (SOP) &amp; Team Delegation Runbook</w:t>
+      </w:r>
+    </w:p>
+    <w:p>
+      <w:pPr>
+        <w:spacing w:after="80" w:before="0"/>
+      </w:pPr>
+      <w:r>
+        <w:rPr>
+          <w:rFonts w:ascii="Calibri" w:cs="Calibri" w:eastAsia="Calibri" w:hAnsi="Calibri"/>
+          <w:b/>
+          <w:bCs/>
+          <w:color w:val="059669"/>
+          <w:sz w:val="18"/>
+          <w:szCs w:val="18"/>
+        </w:rPr>
+        <w:t xml:space="preserve">Category: Operations &amp; Delegation  |  Recommended Model: Claude 3.5 Sonnet  |  Complexity: Advanced  |  Tokens: ~1851</w:t>
+      </w:r>
+    </w:p>
+    <w:p>
+      <w:pPr>
+        <w:spacing w:after="40" w:before="40"/>
+      </w:pPr>
+      <w:r>
+        <w:rPr>
+          <w:b/>
+          <w:bCs/>
+          <w:sz w:val="20"/>
+          <w:szCs w:val="20"/>
+        </w:rPr>
+        <w:t xml:space="preserve">Core Professional Objective: </w:t>
+      </w:r>
+      <w:r>
+        <w:rPr>
+          <w:sz w:val="20"/>
+          <w:szCs w:val="20"/>
+        </w:rPr>
+        <w:t xml:space="preserve">Create a step-by-step delegation runbook enabling junior staff, apprentices, or assistants to execute complex workflows flawlessly without supervision.</w:t>
+      </w:r>
+    </w:p>
+    <w:p>
+      <w:pPr>
+        <w:spacing w:after="40" w:before="60"/>
+      </w:pPr>
+      <w:r>
+        <w:rPr>
+          <w:b/>
+          <w:bCs/>
+          <w:sz w:val="20"/>
+          <w:szCs w:val="20"/>
+        </w:rPr>
+        <w:t xml:space="preserve">Sequential Execution Steps:</w:t>
+      </w:r>
+    </w:p>
+    <w:p>
+      <w:pPr>
+        <w:spacing w:after="20" w:before="20"/>
+        <w:ind w:left="360"/>
+      </w:pPr>
+      <w:r>
+        <w:rPr>
+          <w:b/>
+          <w:bCs/>
+          <w:color w:val="059669"/>
+          <w:sz w:val="20"/>
+          <w:szCs w:val="20"/>
+        </w:rPr>
+        <w:t xml:space="preserve">• </w:t>
+      </w:r>
+      <w:r>
+        <w:rPr>
+          <w:sz w:val="20"/>
+          <w:szCs w:val="20"/>
+        </w:rPr>
+        <w:t xml:space="preserve">Pre-Requisite Checklist: Tools, access permissions, and required inputs.</w:t>
+      </w:r>
+    </w:p>
+    <w:p>
+      <w:pPr>
+        <w:spacing w:after="20" w:before="20"/>
+        <w:ind w:left="360"/>
+      </w:pPr>
+      <w:r>
+        <w:rPr>
+          <w:b/>
+          <w:bCs/>
+          <w:color w:val="059669"/>
+          <w:sz w:val="20"/>
+          <w:szCs w:val="20"/>
+        </w:rPr>
+        <w:t xml:space="preserve">• </w:t>
+      </w:r>
+      <w:r>
+        <w:rPr>
+          <w:sz w:val="20"/>
+          <w:szCs w:val="20"/>
+        </w:rPr>
+        <w:t xml:space="preserve">Step-by-Step Execution Sequence: Explicit chronological instructions with screenshots/criteria.</w:t>
+      </w:r>
+    </w:p>
+    <w:p>
+      <w:pPr>
+        <w:spacing w:after="20" w:before="20"/>
+        <w:ind w:left="360"/>
+      </w:pPr>
+      <w:r>
+        <w:rPr>
+          <w:b/>
+          <w:bCs/>
+          <w:color w:val="059669"/>
+          <w:sz w:val="20"/>
+          <w:szCs w:val="20"/>
+        </w:rPr>
+        <w:t xml:space="preserve">• </w:t>
+      </w:r>
+      <w:r>
+        <w:rPr>
+          <w:sz w:val="20"/>
+          <w:szCs w:val="20"/>
+        </w:rPr>
+        <w:t xml:space="preserve">Troubleshooting Decision Tree: If/Then logic for common errors or edge cases.</w:t>
+      </w:r>
+    </w:p>
+    <w:p>
+      <w:pPr>
+        <w:spacing w:after="20" w:before="20"/>
+        <w:ind w:left="360"/>
+      </w:pPr>
+      <w:r>
+        <w:rPr>
+          <w:b/>
+          <w:bCs/>
+          <w:color w:val="059669"/>
+          <w:sz w:val="20"/>
+          <w:szCs w:val="20"/>
+        </w:rPr>
+        <w:t xml:space="preserve">• </w:t>
+      </w:r>
+      <w:r>
+        <w:rPr>
+          <w:sz w:val="20"/>
+          <w:szCs w:val="20"/>
+        </w:rPr>
+        <w:t xml:space="preserve">Quality Sign-Off Gate: Specific acceptance criteria before submitting to lead.</w:t>
+      </w:r>
+    </w:p>
+    <w:p>
+      <w:pPr>
+        <w:spacing w:after="40" w:before="60"/>
+      </w:pPr>
+      <w:r>
+        <w:rPr>
+          <w:b/>
+          <w:bCs/>
+          <w:sz w:val="20"/>
+          <w:szCs w:val="20"/>
+        </w:rPr>
+        <w:t xml:space="preserve">Input Variables &amp; Parameters:</w:t>
+      </w:r>
+    </w:p>
+    <w:p>
+      <w:pPr>
+        <w:spacing w:after="20" w:before="20"/>
+        <w:ind w:left="360"/>
+      </w:pPr>
+      <w:r>
+        <w:rPr>
+          <w:b/>
+          <w:bCs/>
+          <w:color w:val="B45309"/>
+          <w:sz w:val="19"/>
+          <w:szCs w:val="19"/>
+        </w:rPr>
+        <w:t xml:space="preserve">{{DELEGATED_WORKFLOW_NAME}}: </w:t>
+      </w:r>
+      <w:r>
+        <w:rPr>
+          <w:sz w:val="19"/>
+          <w:szCs w:val="19"/>
+        </w:rPr>
+        <w:t xml:space="preserve">Name of the operational workflow (Default: "Routine daily execution in Fitness Coaching, Strength &amp; Conditioning")</w:t>
+      </w:r>
+    </w:p>
+    <w:p>
+      <w:pPr>
+        <w:spacing w:after="20" w:before="20"/>
+        <w:ind w:left="360"/>
+      </w:pPr>
+      <w:r>
+        <w:rPr>
+          <w:b/>
+          <w:bCs/>
+          <w:color w:val="B45309"/>
+          <w:sz w:val="19"/>
+          <w:szCs w:val="19"/>
+        </w:rPr>
+        <w:t xml:space="preserve">{{ASSIGNEE_SKILL_LEVEL}}: </w:t>
+      </w:r>
+      <w:r>
+        <w:rPr>
+          <w:sz w:val="19"/>
+          <w:szCs w:val="19"/>
+        </w:rPr>
+        <w:t xml:space="preserve">Target skill level of team member (Default: "Junior Professional / Apprentice")</w:t>
+      </w:r>
+    </w:p>
+    <w:p>
+      <w:pPr>
+        <w:spacing w:after="20" w:before="20"/>
+        <w:ind w:left="360"/>
+      </w:pPr>
+      <w:r>
+        <w:rPr>
+          <w:b/>
+          <w:bCs/>
+          <w:color w:val="B45309"/>
+          <w:sz w:val="19"/>
+          <w:szCs w:val="19"/>
+        </w:rPr>
+        <w:t xml:space="preserve">{{VERIFICATION_CHECKPOINTS}}: </w:t>
+      </w:r>
+      <w:r>
+        <w:rPr>
+          <w:sz w:val="19"/>
+          <w:szCs w:val="19"/>
+        </w:rPr>
+        <w:t xml:space="preserve">Required sign-off checkpoints (Default: "Pre-flight check, mid-execution review, final delivery sign-off")</w:t>
+      </w:r>
+    </w:p>
+    <w:p>
+      <w:pPr>
+        <w:spacing w:after="40" w:before="80"/>
+      </w:pPr>
+      <w:r>
+        <w:rPr>
+          <w:b/>
+          <w:bCs/>
+          <w:sz w:val="20"/>
+          <w:szCs w:val="20"/>
+        </w:rPr>
+        <w:t xml:space="preserve">Production Prompt Template (XML):</w:t>
+      </w:r>
+    </w:p>
+    <w:p>
+      <w:pPr>
+        <w:spacing w:after="80" w:before="20"/>
+      </w:pPr>
+      <w:r>
+        <w:rPr>
+          <w:rFonts w:ascii="Courier New" w:cs="Courier New" w:eastAsia="Courier New" w:hAnsi="Courier New"/>
+          <w:color w:val="1E293B"/>
+          <w:sz w:val="17"/>
+          <w:szCs w:val="17"/>
+        </w:rPr>
+        <w:t xml:space="preserve">&lt;system_role&gt;
+You are an expert Master Personal Trainer &amp; Strength Coach operating strictly under NASM &amp; NSCA Strength &amp; Conditioning Certified standards.
+Your objective is to produce ready-to-deploy professional work product with zero generic boilerplate.
+&lt;/system_role&gt;
+&lt;input_parameters&gt;
+DELEGATED_WORKFLOW_NAME: {{DELEGATED_WORKFLOW_NAME}}
+ASSIGNEE_SKILL_LEVEL: {{ASSIGNEE_SKILL_LEVEL}}
+VERIFICATION_CHECKPOINTS: {{VERIFICATION_CHECKPOINTS}}
+&lt;/input_parameters&gt;
+&lt;deliverable_specifications&gt;
+1. Professional Objective: Create a step-by-step delegation runbook enabling junior staff, apprentices, or assistants to execute complex workflows flawlessly without supervision.
+2. Governing Framework: NASM &amp; NSCA Strength &amp; Conditioning Certified
+3. Execution Steps:
+   Step 1: Pre-Requisite Checklist: Tools, access permissions, and required inputs.
+   Step 2: Step-by-Step Execution Sequence: Explicit chronological instructions with screenshots/criteria.
+   Step 3: Troubleshooting Decision Tree: If/Then logic for common errors or edge cases.
+   Step 4: Quality Sign-Off Gate: Specific acceptance criteria before submitting to lead.
+4. Strict Negative Constraints:
+   - Zero generic corporate filler or placeholder tags.
+   - All quantitative figures, standards, and references must be realistic and fully written out.
+   - If required parameters are missing, prompt for clarification rather than fabricating data.
+&lt;/deliverable_specifications&gt;
+&lt;output_formatting&gt;
+Deliver a structured, production-grade professional document with labeled sections, technical parameters, and actionable checkpoints.
+&lt;/output_formatting&gt;</w:t>
+      </w:r>
+    </w:p>
+    <w:p>
+      <w:pPr>
+        <w:spacing w:after="40" w:before="60"/>
+      </w:pPr>
+      <w:r>
+        <w:rPr>
+          <w:b/>
+          <w:bCs/>
+          <w:sz w:val="19"/>
+          <w:szCs w:val="19"/>
+        </w:rPr>
+        <w:t xml:space="preserve">Verified Work Product Sample Output: </w:t>
+      </w:r>
+    </w:p>
+    <w:p>
+      <w:pPr>
+        <w:spacing w:after="120" w:before="20"/>
+      </w:pPr>
+      <w:r>
+        <w:rPr>
+          <w:rFonts w:ascii="Calibri" w:cs="Calibri" w:eastAsia="Calibri" w:hAnsi="Calibri"/>
+          <w:i/>
+          <w:iCs/>
+          <w:color w:val="475569"/>
+          <w:sz w:val="18"/>
+          <w:szCs w:val="18"/>
+        </w:rPr>
+        <w:t xml:space="preserve">### STANDARD OPERATING PROCEDURE (SOP)
+**Workflow:** Daily Operational Execution | **Audience:** Junior Team Members &amp; Associates
+#### 1. Pre-Flight Preparation Checklist
+- [ ] Confirm all input datasets are sanitized and verified against NASM &amp; NSCA Strength &amp; Conditioning Certified.
+- [ ] Verify access credentials to internal repositories and documentation systems.
+#### 2. Chronological Execution Sequence
+1. **Intake Normalization:** Open daily task queue and verify parameters against standard templates.
+2. **Execution Phase:** Process task using approved prompt templates with zero ad-hoc modifications.
+3. **Quality Self-Audit:** Verify output against the 5-point quality checklist before requesting review.
+#### 3. Escalation Decision Protocol
+- *If input data lacks required fields:* Do NOT guess. Place item in Pending Hold and notify lead.
+- *If execution time exceeds standard SLA by &gt; 20%:* Flag bottleneck in team chat immediately.</w:t>
+      </w:r>
+    </w:p>
+    <w:p>
+      <w:pPr>
+        <w:spacing w:after="200" w:before="40"/>
+      </w:pPr>
+      <w:r>
+        <w:rPr>
+          <w:b/>
+          <w:bCs/>
+          <w:color w:val="059669"/>
+          <w:sz w:val="18"/>
+          <w:szCs w:val="18"/>
+        </w:rPr>
+        <w:t xml:space="preserve">Implementation Pro Tip: </w:t>
+      </w:r>
+      <w:r>
+        <w:rPr>
+          <w:sz w:val="18"/>
+          <w:szCs w:val="18"/>
+        </w:rPr>
+        <w:t xml:space="preserve">Use this SOP during onboarding to get new associates delivering client-ready work within their first 48 hours.</w:t>
       </w:r>
     </w:p>
     <w:p>
@@ -1203,7 +2285,21 @@
           <w:sz w:val="26"/>
           <w:szCs w:val="26"/>
         </w:rPr>
-        <w:t xml:space="preserve">PART VI: AUTOMATION &amp; API INTEGRATION RECIPES</w:t>
+        <w:t xml:space="preserve">PART V: CLAUDE PROJECT KNOWLEDGE BASE TRANSCRIPTS</w:t>
+      </w:r>
+    </w:p>
+    <w:p>
+      <w:pPr>
+        <w:spacing w:after="180" w:before="60"/>
+      </w:pPr>
+      <w:r>
+        <w:rPr>
+          <w:rFonts w:ascii="Calibri" w:cs="Calibri" w:eastAsia="Calibri" w:hAnsi="Calibri"/>
+          <w:color w:val="475569"/>
+          <w:sz w:val="20"/>
+          <w:szCs w:val="20"/>
+        </w:rPr>
+        <w:t xml:space="preserve">Upload these institutional knowledge files into the "Project Knowledge" section of Claude Projects to equip the model with domain reference standards.</w:t>
       </w:r>
     </w:p>
     <w:p>
@@ -1220,7 +2316,7 @@
           <w:sz w:val="22"/>
           <w:szCs w:val="22"/>
         </w:rPr>
-        <w:t xml:space="preserve">Master Personal Trainer &amp; Strength Coach Automated Client Intake Pipeline</w:t>
+        <w:t xml:space="preserve">File: certified-personal-trainer-ai-prompts-system-workflows_clinical_practice_standards.md</w:t>
       </w:r>
     </w:p>
     <w:p>
@@ -1229,118 +2325,30 @@
       </w:pPr>
       <w:r>
         <w:rPr>
-          <w:rFonts w:ascii="Calibri" w:cs="Calibri" w:eastAsia="Calibri" w:hAnsi="Calibri"/>
-          <w:b/>
-          <w:bCs/>
+          <w:i/>
+          <w:iCs/>
           <w:color w:val="059669"/>
           <w:sz w:val="18"/>
           <w:szCs w:val="18"/>
         </w:rPr>
-        <w:t xml:space="preserve">Tooling Stack: Zapier / Make + Claude API + Slack / Google Docs  |  Trigger: New client inquiry form submission or file upload</w:t>
-      </w:r>
-    </w:p>
-    <w:p>
-      <w:pPr>
-        <w:spacing w:after="40" w:before="40"/>
-      </w:pPr>
-      <w:r>
-        <w:rPr>
-          <w:b/>
-          <w:bCs/>
-          <w:sz w:val="20"/>
-          <w:szCs w:val="20"/>
-        </w:rPr>
-        <w:t xml:space="preserve">Pipeline Execution Sequence:</w:t>
-      </w:r>
-    </w:p>
-    <w:p>
-      <w:pPr>
-        <w:spacing w:after="20" w:before="20"/>
-        <w:ind w:left="360"/>
-      </w:pPr>
-      <w:r>
-        <w:rPr>
-          <w:b/>
-          <w:bCs/>
-          <w:color w:val="B45309"/>
-          <w:sz w:val="20"/>
-          <w:szCs w:val="20"/>
-        </w:rPr>
-        <w:t xml:space="preserve">→ </w:t>
-      </w:r>
-      <w:r>
-        <w:rPr>
-          <w:sz w:val="20"/>
-          <w:szCs w:val="20"/>
-        </w:rPr>
-        <w:t xml:space="preserve">Extract raw input fields from web intake form.</w:t>
-      </w:r>
-    </w:p>
-    <w:p>
-      <w:pPr>
-        <w:spacing w:after="20" w:before="20"/>
-        <w:ind w:left="360"/>
-      </w:pPr>
-      <w:r>
-        <w:rPr>
-          <w:b/>
-          <w:bCs/>
-          <w:color w:val="B45309"/>
-          <w:sz w:val="20"/>
-          <w:szCs w:val="20"/>
-        </w:rPr>
-        <w:t xml:space="preserve">→ </w:t>
-      </w:r>
-      <w:r>
-        <w:rPr>
-          <w:sz w:val="20"/>
-          <w:szCs w:val="20"/>
-        </w:rPr>
-        <w:t xml:space="preserve">Run through Master Personal Trainer &amp; Strength Coach core triage prompt chain.</w:t>
-      </w:r>
-    </w:p>
-    <w:p>
-      <w:pPr>
-        <w:spacing w:after="20" w:before="20"/>
-        <w:ind w:left="360"/>
-      </w:pPr>
-      <w:r>
-        <w:rPr>
-          <w:b/>
-          <w:bCs/>
-          <w:color w:val="B45309"/>
-          <w:sz w:val="20"/>
-          <w:szCs w:val="20"/>
-        </w:rPr>
-        <w:t xml:space="preserve">→ </w:t>
-      </w:r>
-      <w:r>
-        <w:rPr>
-          <w:sz w:val="20"/>
-          <w:szCs w:val="20"/>
-        </w:rPr>
-        <w:t xml:space="preserve">Generate structured briefing memo and notify practitioner via email or Slack.</w:t>
-      </w:r>
-    </w:p>
-    <w:p>
-      <w:pPr>
-        <w:spacing w:after="160" w:before="60"/>
-      </w:pPr>
-      <w:r>
-        <w:rPr>
-          <w:b/>
-          <w:bCs/>
-          <w:sz w:val="20"/>
-          <w:szCs w:val="20"/>
-        </w:rPr>
-        <w:t xml:space="preserve">Expected Automated Outcome: </w:t>
-      </w:r>
-      <w:r>
-        <w:rPr>
-          <w:sz w:val="20"/>
-          <w:szCs w:val="20"/>
-        </w:rPr>
-        <w:t xml:space="preserve">Comprehensive, structured operational brief prepared before the practitioner opens the file.</w:t>
+        <w:t xml:space="preserve">Purpose: HIPAA privacy protocols and evidence-based clinical rules.</w:t>
+      </w:r>
+    </w:p>
+    <w:p>
+      <w:pPr>
+        <w:spacing w:after="160" w:before="20"/>
+      </w:pPr>
+      <w:r>
+        <w:rPr>
+          <w:rFonts w:ascii="Courier New" w:cs="Courier New" w:eastAsia="Courier New" w:hAnsi="Courier New"/>
+          <w:color w:val="1E293B"/>
+          <w:sz w:val="17"/>
+          <w:szCs w:val="17"/>
+        </w:rPr>
+        <w:t xml:space="preserve"># Clinical Practice Standard: NASM &amp; NSCA Strength &amp; Conditioning Certified
+1. **HIPAA Privacy Mandate:** Strict de-identification of all 18 PHI identifiers required prior to prompt execution.
+2. **Clinical Necessity Documentation:** Prior authorization appeals and treatment plans must cite peer-reviewed clinical studies (AMA/CPT guidelines) and failed conservative therapies.
+3. **Biomechanical Progression:** Exercise prescription must respect progressive overload thresholds and contraindications for acute inflammation or surgical post-op states.</w:t>
       </w:r>
     </w:p>
     <w:p>
@@ -1358,7 +2366,7 @@
           <w:sz w:val="26"/>
           <w:szCs w:val="26"/>
         </w:rPr>
-        <w:t xml:space="preserve">PART VII: 30-60-90 DAY FIRM AI ADOPTION ROADMAP</w:t>
+        <w:t xml:space="preserve">PART VI: AUTOMATION &amp; API INTEGRATION RECIPES</w:t>
       </w:r>
     </w:p>
     <w:p>
@@ -1375,7 +2383,7 @@
           <w:sz w:val="22"/>
           <w:szCs w:val="22"/>
         </w:rPr>
-        <w:t xml:space="preserve">Day 1 - 7: Workspace &amp; System Prompt Configuration</w:t>
+        <w:t xml:space="preserve">Master Personal Trainer &amp; Strength Coach Automated Clinical Intake &amp; SOAP Note Structuring Pipeline</w:t>
       </w:r>
     </w:p>
     <w:p>
@@ -1384,6 +2392,161 @@
       </w:pPr>
       <w:r>
         <w:rPr>
+          <w:rFonts w:ascii="Calibri" w:cs="Calibri" w:eastAsia="Calibri" w:hAnsi="Calibri"/>
+          <w:b/>
+          <w:bCs/>
+          <w:color w:val="059669"/>
+          <w:sz w:val="18"/>
+          <w:szCs w:val="18"/>
+        </w:rPr>
+        <w:t xml:space="preserve">Tooling Stack: Jane App / SimplePractice + Claude API + Attending Practitioner Portal  |  Trigger: Patient digital intake completion or voice transcription upload</w:t>
+      </w:r>
+    </w:p>
+    <w:p>
+      <w:pPr>
+        <w:spacing w:after="40" w:before="40"/>
+      </w:pPr>
+      <w:r>
+        <w:rPr>
+          <w:b/>
+          <w:bCs/>
+          <w:sz w:val="20"/>
+          <w:szCs w:val="20"/>
+        </w:rPr>
+        <w:t xml:space="preserve">Pipeline Execution Sequence:</w:t>
+      </w:r>
+    </w:p>
+    <w:p>
+      <w:pPr>
+        <w:spacing w:after="20" w:before="20"/>
+        <w:ind w:left="360"/>
+      </w:pPr>
+      <w:r>
+        <w:rPr>
+          <w:b/>
+          <w:bCs/>
+          <w:color w:val="B45309"/>
+          <w:sz w:val="20"/>
+          <w:szCs w:val="20"/>
+        </w:rPr>
+        <w:t xml:space="preserve">→ </w:t>
+      </w:r>
+      <w:r>
+        <w:rPr>
+          <w:sz w:val="20"/>
+          <w:szCs w:val="20"/>
+        </w:rPr>
+        <w:t xml:space="preserve">De-identify all protected health information (PHI) under HIPAA rules.</w:t>
+      </w:r>
+    </w:p>
+    <w:p>
+      <w:pPr>
+        <w:spacing w:after="20" w:before="20"/>
+        <w:ind w:left="360"/>
+      </w:pPr>
+      <w:r>
+        <w:rPr>
+          <w:b/>
+          <w:bCs/>
+          <w:color w:val="B45309"/>
+          <w:sz w:val="20"/>
+          <w:szCs w:val="20"/>
+        </w:rPr>
+        <w:t xml:space="preserve">→ </w:t>
+      </w:r>
+      <w:r>
+        <w:rPr>
+          <w:sz w:val="20"/>
+          <w:szCs w:val="20"/>
+        </w:rPr>
+        <w:t xml:space="preserve">Execute Chain 1 (Clinical Work Product Spec) to organize findings into Subjective, Objective, Assessment, Plan.</w:t>
+      </w:r>
+    </w:p>
+    <w:p>
+      <w:pPr>
+        <w:spacing w:after="20" w:before="20"/>
+        <w:ind w:left="360"/>
+      </w:pPr>
+      <w:r>
+        <w:rPr>
+          <w:b/>
+          <w:bCs/>
+          <w:color w:val="B45309"/>
+          <w:sz w:val="20"/>
+          <w:szCs w:val="20"/>
+        </w:rPr>
+        <w:t xml:space="preserve">→ </w:t>
+      </w:r>
+      <w:r>
+        <w:rPr>
+          <w:sz w:val="20"/>
+          <w:szCs w:val="20"/>
+        </w:rPr>
+        <w:t xml:space="preserve">Deliver preliminary clinical note to EHR chart for practitioner review and signature.</w:t>
+      </w:r>
+    </w:p>
+    <w:p>
+      <w:pPr>
+        <w:spacing w:after="160" w:before="60"/>
+      </w:pPr>
+      <w:r>
+        <w:rPr>
+          <w:b/>
+          <w:bCs/>
+          <w:sz w:val="20"/>
+          <w:szCs w:val="20"/>
+        </w:rPr>
+        <w:t xml:space="preserve">Expected Automated Outcome: </w:t>
+      </w:r>
+      <w:r>
+        <w:rPr>
+          <w:sz w:val="20"/>
+          <w:szCs w:val="20"/>
+        </w:rPr>
+        <w:t xml:space="preserve">Standardized SOAP progress note prepared before the practitioner enters the exam room.</w:t>
+      </w:r>
+    </w:p>
+    <w:p>
+      <w:pPr>
+        <w:pStyle w:val="Heading1"/>
+        <w:pageBreakBefore/>
+        <w:spacing w:after="180" w:before="240"/>
+      </w:pPr>
+      <w:r>
+        <w:rPr>
+          <w:rFonts w:ascii="Calibri" w:cs="Calibri" w:eastAsia="Calibri" w:hAnsi="Calibri"/>
+          <w:b/>
+          <w:bCs/>
+          <w:color w:val="0F172A"/>
+          <w:sz w:val="26"/>
+          <w:szCs w:val="26"/>
+        </w:rPr>
+        <w:t xml:space="preserve">PART VII: 30-60-90 DAY PROFESSIONAL AI ADOPTION ROADMAP</w:t>
+      </w:r>
+    </w:p>
+    <w:p>
+      <w:pPr>
+        <w:pStyle w:val="Heading2"/>
+        <w:spacing w:after="60" w:before="240"/>
+      </w:pPr>
+      <w:r>
+        <w:rPr>
+          <w:rFonts w:ascii="Calibri" w:cs="Calibri" w:eastAsia="Calibri" w:hAnsi="Calibri"/>
+          <w:b/>
+          <w:bCs/>
+          <w:color w:val="0F172A"/>
+          <w:sz w:val="22"/>
+          <w:szCs w:val="22"/>
+        </w:rPr>
+        <w:t xml:space="preserve">Day 1 - 7: Clinical Practice / Coaching Workspace Setup</w:t>
+      </w:r>
+    </w:p>
+    <w:p>
+      <w:pPr>
+        <w:spacing w:after="60" w:before="0"/>
+      </w:pPr>
+      <w:r>
+        <w:rPr>
           <w:b/>
           <w:bCs/>
           <w:sz w:val="20"/>
@@ -1396,7 +2559,7 @@
           <w:sz w:val="20"/>
           <w:szCs w:val="20"/>
         </w:rPr>
-        <w:t xml:space="preserve">Initialize Claude Projects and Custom GPT workspaces for Master Personal Trainer &amp; Strength Coach.</w:t>
+        <w:t xml:space="preserve">Configure HIPAA-compliant / ethical AI workspaces for Master Personal Trainer &amp; Strength Coach.</w:t>
       </w:r>
     </w:p>
     <w:p>
@@ -1419,7 +2582,7 @@
           <w:sz w:val="20"/>
           <w:szCs w:val="20"/>
         </w:rPr>
-        <w:t xml:space="preserve">Upload Master System Prompt into Claude Projects Custom Instructions.</w:t>
+        <w:t xml:space="preserve">Upload Master System Prompt and clinical / coaching standards.</w:t>
       </w:r>
     </w:p>
     <w:p>
@@ -1442,7 +2605,7 @@
           <w:sz w:val="20"/>
           <w:szCs w:val="20"/>
         </w:rPr>
-        <w:t xml:space="preserve">Import knowledge base guidelines into project memory.</w:t>
+        <w:t xml:space="preserve">Import evidence-based protocols, intake rubrics, and discharge guidelines into project memory.</w:t>
       </w:r>
     </w:p>
     <w:p>
@@ -1465,7 +2628,7 @@
           <w:sz w:val="20"/>
           <w:szCs w:val="20"/>
         </w:rPr>
-        <w:t xml:space="preserve">Execute baseline test run on prompt chain #1 with past sanitized files.</w:t>
+        <w:t xml:space="preserve">Run baseline test with sanitized case notes.</w:t>
       </w:r>
     </w:p>
     <w:p>
@@ -1489,7 +2652,7 @@
           <w:sz w:val="19"/>
           <w:szCs w:val="19"/>
         </w:rPr>
-        <w:t xml:space="preserve">100% adherence to professional standards verified.</w:t>
+        <w:t xml:space="preserve">100% adherence to clinical privacy and scope of practice verified.</w:t>
       </w:r>
     </w:p>
     <w:p>
@@ -1506,7 +2669,7 @@
           <w:sz w:val="22"/>
           <w:szCs w:val="22"/>
         </w:rPr>
-        <w:t xml:space="preserve">Day 8 - 30: Routine Operational Task Deployment</w:t>
+        <w:t xml:space="preserve">Day 8 - 30: Daily Documentation &amp; Protocol Acceleration</w:t>
       </w:r>
     </w:p>
     <w:p>
@@ -1527,7 +2690,7 @@
           <w:sz w:val="20"/>
           <w:szCs w:val="20"/>
         </w:rPr>
-        <w:t xml:space="preserve">Replace manual repetitive drafting with automated prompt chains.</w:t>
+        <w:t xml:space="preserve">Integrate prompt chains into daily clinical charting, programming, and progress tracking.</w:t>
       </w:r>
     </w:p>
     <w:p>
@@ -1550,7 +2713,7 @@
           <w:sz w:val="20"/>
           <w:szCs w:val="20"/>
         </w:rPr>
-        <w:t xml:space="preserve">Deploy daily triage and documentation prompt chains across live workflow.</w:t>
+        <w:t xml:space="preserve">Deploy standardized SOAP / session note structuring for patient and client encounters.</w:t>
       </w:r>
     </w:p>
     <w:p>
@@ -1573,7 +2736,7 @@
           <w:sz w:val="20"/>
           <w:szCs w:val="20"/>
         </w:rPr>
-        <w:t xml:space="preserve">Train support staff on input variable formatting.</w:t>
+        <w:t xml:space="preserve">Automate exercise / treatment progression rubrics and home care instructions.</w:t>
       </w:r>
     </w:p>
     <w:p>
@@ -1596,7 +2759,7 @@
           <w:sz w:val="20"/>
           <w:szCs w:val="20"/>
         </w:rPr>
-        <w:t xml:space="preserve">Track hours saved weekly against firm baseline.</w:t>
+        <w:t xml:space="preserve">Draft empathetic client accountability updates and adherence check-ins.</w:t>
       </w:r>
     </w:p>
     <w:p>
@@ -1620,7 +2783,7 @@
           <w:sz w:val="19"/>
           <w:szCs w:val="19"/>
         </w:rPr>
-        <w:t xml:space="preserve">Reclaim minimum 12 hours/week of productive time.</w:t>
+        <w:t xml:space="preserve">Reclaim 14+ hours weekly previously spent on evening documentation.</w:t>
       </w:r>
     </w:p>
     <w:p>
@@ -1637,7 +2800,7 @@
           <w:sz w:val="22"/>
           <w:szCs w:val="22"/>
         </w:rPr>
-        <w:t xml:space="preserve">Day 31 - 60: Multi-Step Automation &amp; API Integration</w:t>
+        <w:t xml:space="preserve">Day 31 - 60: Edge-Case Triage &amp; Insurance Appeal Automation</w:t>
       </w:r>
     </w:p>
     <w:p>
@@ -1658,7 +2821,7 @@
           <w:sz w:val="20"/>
           <w:szCs w:val="20"/>
         </w:rPr>
-        <w:t xml:space="preserve">Connect prompt workflows to Zapier, Make.com, or internal tools.</w:t>
+        <w:t xml:space="preserve">Automate complex prior authorization appeals and rehabilitation modifications.</w:t>
       </w:r>
     </w:p>
     <w:p>
@@ -1681,7 +2844,7 @@
           <w:sz w:val="20"/>
           <w:szCs w:val="20"/>
         </w:rPr>
-        <w:t xml:space="preserve">Configure webhook triggers for inbound client inquiries or intake forms.</w:t>
+        <w:t xml:space="preserve">Deploy peer-reviewed prior authorization / clinical necessity appeal letters.</w:t>
       </w:r>
     </w:p>
     <w:p>
@@ -1704,7 +2867,7 @@
           <w:sz w:val="20"/>
           <w:szCs w:val="20"/>
         </w:rPr>
-        <w:t xml:space="preserve">Automate structured preliminary review memos sent directly to team email/Slack.</w:t>
+        <w:t xml:space="preserve">Standardize acute pain / client plateau modification trees.</w:t>
       </w:r>
     </w:p>
     <w:p>
@@ -1727,7 +2890,7 @@
           <w:sz w:val="20"/>
           <w:szCs w:val="20"/>
         </w:rPr>
-        <w:t xml:space="preserve">Implement monthly audit log of AI-assisted outputs.</w:t>
+        <w:t xml:space="preserve">Implement automated client intake and screening summaries.</w:t>
       </w:r>
     </w:p>
     <w:p>
@@ -1751,7 +2914,7 @@
           <w:sz w:val="19"/>
           <w:szCs w:val="19"/>
         </w:rPr>
-        <w:t xml:space="preserve">Zero manual copy-pasting for recurring daily intakes.</w:t>
+        <w:t xml:space="preserve">Prior authorization approval rate improved by 35%.</w:t>
       </w:r>
     </w:p>
     <w:p>
@@ -1768,7 +2931,7 @@
           <w:sz w:val="22"/>
           <w:szCs w:val="22"/>
         </w:rPr>
-        <w:t xml:space="preserve">Day 61 - 90: Institutional Mastery &amp; Enterprise Scaling</w:t>
+        <w:t xml:space="preserve">Day 61 - 90: Practice Expansion &amp; Institutional Excellence</w:t>
       </w:r>
     </w:p>
     <w:p>
@@ -1789,7 +2952,7 @@
           <w:sz w:val="20"/>
           <w:szCs w:val="20"/>
         </w:rPr>
-        <w:t xml:space="preserve">Scale prompt operating system across entire practice or business.</w:t>
+        <w:t xml:space="preserve">Scale operational workflows across associate practitioners and support staff.</w:t>
       </w:r>
     </w:p>
     <w:p>
@@ -1812,7 +2975,7 @@
           <w:sz w:val="20"/>
           <w:szCs w:val="20"/>
         </w:rPr>
-        <w:t xml:space="preserve">Conduct quarterly prompt refinement based on client feedback.</w:t>
+        <w:t xml:space="preserve">Train clinic / facility staff on intake documentation workflows.</w:t>
       </w:r>
     </w:p>
     <w:p>
@@ -1835,7 +2998,7 @@
           <w:sz w:val="20"/>
           <w:szCs w:val="20"/>
         </w:rPr>
-        <w:t xml:space="preserve">Certify all team members on firm AI Governance Protocols.</w:t>
+        <w:t xml:space="preserve">Conduct quarterly audit of clinical outcomes and client retention metrics.</w:t>
       </w:r>
     </w:p>
     <w:p>
@@ -1858,7 +3021,7 @@
           <w:sz w:val="20"/>
           <w:szCs w:val="20"/>
         </w:rPr>
-        <w:t xml:space="preserve">Document firm ROI and client turnaround velocity acceleration.</w:t>
+        <w:t xml:space="preserve">Document practice revenue growth and practitioner burnout reduction.</w:t>
       </w:r>
     </w:p>
     <w:p>
@@ -1882,7 +3045,7 @@
           <w:sz w:val="19"/>
           <w:szCs w:val="19"/>
         </w:rPr>
-        <w:t xml:space="preserve">Business achieves 3x faster client turnaround velocity.</w:t>
+        <w:t xml:space="preserve">Practice increases patient / client throughput by 25% with zero documentation backlog.</w:t>
       </w:r>
     </w:p>
     <w:p>
@@ -1914,7 +3077,7 @@
           <w:sz w:val="20"/>
           <w:szCs w:val="20"/>
         </w:rPr>
-        <w:t xml:space="preserve">To ensure 100% statutory compliance and zero hallucination drift, the Lead Practitioner must execute this verification checklist on all AI-assisted deliverables.</w:t>
+        <w:t xml:space="preserve">To ensure rigorous professional execution, quality consistency, and zero hallucination drift, the Head Strength Coach &amp; Studio Director must execute this verification checklist on all AI-assisted deliverables.</w:t>
       </w:r>
     </w:p>
     <w:p>
@@ -1937,7 +3100,7 @@
           <w:sz w:val="20"/>
           <w:szCs w:val="20"/>
         </w:rPr>
-        <w:t xml:space="preserve">Verify input variables strictly align with governing standard: NASM &amp; NSCA Strength &amp; Conditioning Certified.</w:t>
+        <w:t xml:space="preserve">Verify all clinical / training interventions conform to accredited standard: NASM &amp; NSCA Strength &amp; Conditioning Certified.</w:t>
       </w:r>
     </w:p>
     <w:p>
@@ -1960,7 +3123,7 @@
           <w:sz w:val="20"/>
           <w:szCs w:val="20"/>
         </w:rPr>
-        <w:t xml:space="preserve">Confirm zero private client identifiers or confidential details are included in raw prompt.</w:t>
+        <w:t xml:space="preserve">Confirm total patient / client privacy: verify zero PHI, medical record numbers, or personal identifiers remain.</w:t>
       </w:r>
     </w:p>
     <w:p>
@@ -1983,7 +3146,7 @@
           <w:sz w:val="20"/>
           <w:szCs w:val="20"/>
         </w:rPr>
-        <w:t xml:space="preserve">Inspect generated output against statutory cross-references and industry quality benchmarks.</w:t>
+        <w:t xml:space="preserve">Inspect treatment / exercise progression against biomechanical contraindications and patient medical history.</w:t>
       </w:r>
     </w:p>
     <w:p>
@@ -2006,7 +3169,7 @@
           <w:sz w:val="20"/>
           <w:szCs w:val="20"/>
         </w:rPr>
-        <w:t xml:space="preserve">Verify quantitative figures and cost estimates balance to 100% precision.</w:t>
+        <w:t xml:space="preserve">Verify quantitative dosages, sets, reps, or heart rate zones balance to exact clinical protocol.</w:t>
       </w:r>
     </w:p>
     <w:p>
@@ -2029,7 +3192,7 @@
           <w:sz w:val="20"/>
           <w:szCs w:val="20"/>
         </w:rPr>
-        <w:t xml:space="preserve">Log execution timestamp and accountable senior practitioner initials in compliance record.</w:t>
+        <w:t xml:space="preserve">Log clinical execution timestamp and licensed practitioner initials in chart audit record.</w:t>
       </w:r>
     </w:p>
     <w:p>
@@ -2060,7 +3223,7 @@
           <w:sz w:val="20"/>
           <w:szCs w:val="20"/>
         </w:rPr>
-        <w:t xml:space="preserve">This document certifies that the purchaser has acquired a perpetual, royalty-free commercial single-seat operating license for the Master Personal Trainer &amp; Strength Coach AI Operating System. The licensee is authorized to utilize all system prompts, prompt chains, knowledge base templates, and automation workflows across internal commercial operations.</w:t>
+        <w:t xml:space="preserve">This document certifies that the purchaser has acquired a perpetual, royalty-free commercial single-seat operating license for the Master Personal Trainer &amp; Strength Coach AI Operating System. The licensee is authorized to utilize all system prompts, prompt chains, knowledge base templates, and automation workflows across internal professional operations.</w:t>
       </w:r>
     </w:p>
     <w:p>

</xml_diff>